<commit_message>
redaccion de poblacion (impacto) hecha
</commit_message>
<xml_diff>
--- a/plantilla_EIA.docx
+++ b/plantilla_EIA.docx
@@ -6780,11 +6780,9 @@
       <w:r>
         <w:t>{{</w:t>
       </w:r>
-      <w:proofErr w:type="spellStart"/>
       <w:r>
         <w:t>PH_Antecedentes</w:t>
       </w:r>
-      <w:proofErr w:type="spellEnd"/>
       <w:r>
         <w:t>}}</w:t>
       </w:r>
@@ -6829,18 +6827,8 @@
       <w:r>
         <w:t>perforación de {{</w:t>
       </w:r>
-      <w:proofErr w:type="spellStart"/>
-      <w:proofErr w:type="gramStart"/>
-      <w:r>
-        <w:t>parametros.diametro</w:t>
-      </w:r>
-      <w:proofErr w:type="gramEnd"/>
-      <w:r>
-        <w:t>_perforacion_definitivo_mm</w:t>
-      </w:r>
-      <w:proofErr w:type="spellEnd"/>
-      <w:r>
-        <w:t>}}</w:t>
+      <w:r>
+        <w:t>parametros.diametro_perforacion_definitivo_mm}}</w:t>
       </w:r>
       <w:r>
         <w:t xml:space="preserve"> mm de di</w:t>
@@ -7037,15 +7025,7 @@
         </w:tabs>
       </w:pPr>
       <w:r>
-        <w:t>{{</w:t>
-      </w:r>
-      <w:proofErr w:type="spellStart"/>
-      <w:r>
-        <w:t>PH_Localizacion</w:t>
-      </w:r>
-      <w:proofErr w:type="spellEnd"/>
-      <w:r>
-        <w:t>}}</w:t>
+        <w:t>{{PH_Localizacion}}</w:t>
       </w:r>
     </w:p>
     <w:tbl>
@@ -7141,15 +7121,7 @@
               <w:t xml:space="preserve">HUSO </w:t>
             </w:r>
             <w:r>
-              <w:t>{{</w:t>
-            </w:r>
-            <w:proofErr w:type="spellStart"/>
-            <w:r>
-              <w:t>utm_huso_principal</w:t>
-            </w:r>
-            <w:proofErr w:type="spellEnd"/>
-            <w:r>
-              <w:t>}}</w:t>
+              <w:t>{{utm_huso_principal}}</w:t>
             </w:r>
           </w:p>
         </w:tc>
@@ -7185,38 +7157,28 @@
               <w:t xml:space="preserve">X = </w:t>
             </w:r>
             <w:r>
+              <w:t>{{utm_x_principal}}</w:t>
+            </w:r>
+          </w:p>
+        </w:tc>
+        <w:tc>
+          <w:tcPr>
+            <w:tcW w:w="0" w:type="auto"/>
+            <w:vAlign w:val="center"/>
+          </w:tcPr>
+          <w:p>
+            <w:pPr>
+              <w:jc w:val="center"/>
+            </w:pPr>
+            <w:r>
+              <w:t xml:space="preserve">Latitud = </w:t>
+            </w:r>
+            <w:r>
               <w:t>{{</w:t>
             </w:r>
-            <w:proofErr w:type="spellStart"/>
-            <w:r>
-              <w:t>utm_x_principal</w:t>
-            </w:r>
-            <w:proofErr w:type="spellEnd"/>
-            <w:r>
-              <w:t>}}</w:t>
-            </w:r>
-          </w:p>
-        </w:tc>
-        <w:tc>
-          <w:tcPr>
-            <w:tcW w:w="0" w:type="auto"/>
-            <w:vAlign w:val="center"/>
-          </w:tcPr>
-          <w:p>
-            <w:pPr>
-              <w:jc w:val="center"/>
-            </w:pPr>
-            <w:r>
-              <w:t xml:space="preserve">Latitud = </w:t>
-            </w:r>
-            <w:r>
-              <w:t>{{</w:t>
-            </w:r>
-            <w:proofErr w:type="spellStart"/>
             <w:r>
               <w:t>geo_lat_principal</w:t>
             </w:r>
-            <w:proofErr w:type="spellEnd"/>
             <w:r>
               <w:t>}}</w:t>
             </w:r>
@@ -7241,34 +7203,25 @@
               <w:t xml:space="preserve">Y = </w:t>
             </w:r>
             <w:r>
+              <w:t>{{utm_y_principal}}</w:t>
+            </w:r>
+          </w:p>
+        </w:tc>
+        <w:tc>
+          <w:tcPr>
+            <w:tcW w:w="0" w:type="auto"/>
+            <w:vAlign w:val="center"/>
+          </w:tcPr>
+          <w:p>
+            <w:pPr>
+              <w:jc w:val="center"/>
+            </w:pPr>
+            <w:r>
+              <w:t xml:space="preserve">Longitud = </w:t>
+            </w:r>
+            <w:r>
               <w:t>{{</w:t>
             </w:r>
-            <w:proofErr w:type="spellStart"/>
-            <w:r>
-              <w:t>utm_y_principal</w:t>
-            </w:r>
-            <w:proofErr w:type="spellEnd"/>
-            <w:r>
-              <w:t>}}</w:t>
-            </w:r>
-          </w:p>
-        </w:tc>
-        <w:tc>
-          <w:tcPr>
-            <w:tcW w:w="0" w:type="auto"/>
-            <w:vAlign w:val="center"/>
-          </w:tcPr>
-          <w:p>
-            <w:pPr>
-              <w:jc w:val="center"/>
-            </w:pPr>
-            <w:r>
-              <w:t xml:space="preserve">Longitud = </w:t>
-            </w:r>
-            <w:r>
-              <w:t>{{</w:t>
-            </w:r>
-            <w:proofErr w:type="spellStart"/>
             <w:r>
               <w:t>geo_</w:t>
             </w:r>
@@ -7278,7 +7231,6 @@
             <w:r>
               <w:t>_principal</w:t>
             </w:r>
-            <w:proofErr w:type="spellEnd"/>
             <w:r>
               <w:t>}}</w:t>
             </w:r>
@@ -7356,22 +7308,12 @@
         </w:rPr>
         <w:t>{{</w:t>
       </w:r>
-      <w:proofErr w:type="spellStart"/>
-      <w:proofErr w:type="gramStart"/>
       <w:r>
         <w:rPr>
           <w:rFonts w:cs="Times New Roman"/>
         </w:rPr>
-        <w:t>parametros.profundidad</w:t>
-      </w:r>
-      <w:proofErr w:type="gramEnd"/>
-      <w:r>
-        <w:rPr>
-          <w:rFonts w:cs="Times New Roman"/>
-        </w:rPr>
-        <w:t>_proyectada_m</w:t>
-      </w:r>
-      <w:proofErr w:type="spellEnd"/>
+        <w:t>parametros.profundidad_proyectada_m</w:t>
+      </w:r>
       <w:r>
         <w:rPr>
           <w:rFonts w:cs="Times New Roman"/>
@@ -7420,14 +7362,12 @@
         </w:rPr>
         <w:t xml:space="preserve">La perforación del sondeo se realizará por el sistema de </w:t>
       </w:r>
-      <w:proofErr w:type="spellStart"/>
       <w:r>
         <w:rPr>
           <w:rFonts w:cs="Times New Roman"/>
         </w:rPr>
         <w:t>rotopercusion</w:t>
       </w:r>
-      <w:proofErr w:type="spellEnd"/>
       <w:r>
         <w:rPr>
           <w:rFonts w:cs="Times New Roman"/>
@@ -7464,21 +7404,7 @@
         <w:rPr>
           <w:rFonts w:cs="Times New Roman"/>
         </w:rPr>
-        <w:t xml:space="preserve">hace de barrido de </w:t>
-      </w:r>
-      <w:proofErr w:type="gramStart"/>
-      <w:r>
-        <w:rPr>
-          <w:rFonts w:cs="Times New Roman"/>
-        </w:rPr>
-        <w:t>los mismos</w:t>
-      </w:r>
-      <w:proofErr w:type="gramEnd"/>
-      <w:r>
-        <w:rPr>
-          <w:rFonts w:cs="Times New Roman"/>
-        </w:rPr>
-        <w:t xml:space="preserve"> al exterior</w:t>
+        <w:t>hace de barrido de los mismos al exterior</w:t>
       </w:r>
       <w:r>
         <w:rPr>
@@ -7699,14 +7625,12 @@
         </w:rPr>
         <w:t>{{</w:t>
       </w:r>
-      <w:proofErr w:type="spellStart"/>
       <w:r>
         <w:rPr>
           <w:rFonts w:cs="Times New Roman"/>
         </w:rPr>
         <w:t>diametro_perforacion_inicial_mm</w:t>
       </w:r>
-      <w:proofErr w:type="spellEnd"/>
       <w:r>
         <w:rPr>
           <w:rFonts w:cs="Times New Roman"/>
@@ -7764,22 +7688,14 @@
         <w:rPr>
           <w:rFonts w:cs="Times New Roman"/>
         </w:rPr>
-        <w:t xml:space="preserve">acero, con un espesor de 4 </w:t>
-      </w:r>
-      <w:proofErr w:type="spellStart"/>
+        <w:t>acero, con un espesor de 4 mm</w:t>
+      </w:r>
       <w:r>
         <w:rPr>
           <w:rFonts w:cs="Times New Roman"/>
         </w:rPr>
-        <w:t>mm</w:t>
-      </w:r>
-      <w:r>
-        <w:rPr>
-          <w:rFonts w:cs="Times New Roman"/>
-        </w:rPr>
         <w:t>.</w:t>
       </w:r>
-      <w:proofErr w:type="spellEnd"/>
     </w:p>
     <w:p>
       <w:pPr>
@@ -7847,7 +7763,6 @@
           <w:u w:val="single"/>
         </w:rPr>
       </w:pPr>
-      <w:proofErr w:type="spellStart"/>
       <w:r>
         <w:rPr>
           <w:rFonts w:cs="Times New Roman"/>
@@ -7855,7 +7770,6 @@
         </w:rPr>
         <w:t>Engravillado</w:t>
       </w:r>
-      <w:proofErr w:type="spellEnd"/>
     </w:p>
     <w:p>
       <w:pPr>
@@ -8079,21 +7993,7 @@
         <w:rPr>
           <w:rFonts w:cs="Times New Roman"/>
         </w:rPr>
-        <w:t xml:space="preserve">Finalizado el sondeo se podrá proceder al aforo </w:t>
-      </w:r>
-      <w:proofErr w:type="gramStart"/>
-      <w:r>
-        <w:rPr>
-          <w:rFonts w:cs="Times New Roman"/>
-        </w:rPr>
-        <w:t>del mismo</w:t>
-      </w:r>
-      <w:proofErr w:type="gramEnd"/>
-      <w:r>
-        <w:rPr>
-          <w:rFonts w:cs="Times New Roman"/>
-        </w:rPr>
-        <w:t xml:space="preserve">. Éste se hará durante 16 horas ininterrumpidas con la bomba colocada 3 m por debajo de la última formación acuífera. Se estabilizarán niveles cada </w:t>
+        <w:t xml:space="preserve">Finalizado el sondeo se podrá proceder al aforo del mismo. Éste se hará durante 16 horas ininterrumpidas con la bomba colocada 3 m por debajo de la última formación acuífera. Se estabilizarán niveles cada </w:t>
       </w:r>
       <w:r>
         <w:rPr>
@@ -8146,45 +8046,51 @@
         <w:rPr>
           <w:rFonts w:cs="Times New Roman"/>
         </w:rPr>
-        <w:t>{{</w:t>
-      </w:r>
-      <w:proofErr w:type="spellStart"/>
+        <w:t>{{caudal_</w:t>
+      </w:r>
       <w:r>
         <w:rPr>
           <w:rFonts w:cs="Times New Roman"/>
         </w:rPr>
-        <w:t>caudal_</w:t>
+        <w:t>max_instantaneo</w:t>
       </w:r>
       <w:r>
         <w:rPr>
           <w:rFonts w:cs="Times New Roman"/>
         </w:rPr>
-        <w:t>max_instantaneo</w:t>
+        <w:t>_l_s</w:t>
       </w:r>
       <w:r>
         <w:rPr>
           <w:rFonts w:cs="Times New Roman"/>
         </w:rPr>
-        <w:t>_l_s</w:t>
-      </w:r>
-      <w:proofErr w:type="spellEnd"/>
+        <w:t>}}</w:t>
+      </w:r>
       <w:r>
         <w:rPr>
           <w:rFonts w:cs="Times New Roman"/>
         </w:rPr>
-        <w:t>}}</w:t>
+        <w:t xml:space="preserve"> </w:t>
       </w:r>
       <w:r>
         <w:rPr>
           <w:rFonts w:cs="Times New Roman"/>
         </w:rPr>
-        <w:t xml:space="preserve"> </w:t>
-      </w:r>
-      <w:r>
+        <w:t>l/s.</w:t>
+      </w:r>
+    </w:p>
+    <w:p>
+      <w:pPr>
+        <w:ind w:left="567"/>
         <w:rPr>
           <w:rFonts w:cs="Times New Roman"/>
         </w:rPr>
-        <w:t>l/s.</w:t>
+      </w:pPr>
+      <w:r>
+        <w:rPr>
+          <w:rFonts w:cs="Times New Roman"/>
+        </w:rPr>
+        <w:t xml:space="preserve">La tubería de impulsión estará formada por tramos independientes de tubo de acero estirado sin soldadura, acoplados entre sí por bridas de acero electrosoldadas, y con una junta de goma para conseguir una buena estanqueidad. </w:t>
       </w:r>
     </w:p>
     <w:p>
@@ -8198,7 +8104,7 @@
         <w:rPr>
           <w:rFonts w:cs="Times New Roman"/>
         </w:rPr>
-        <w:t xml:space="preserve">La tubería de impulsión estará formada por tramos independientes de tubo de acero estirado sin soldadura, acoplados entre sí por bridas de acero electrosoldadas, y con una junta de goma para conseguir una buena estanqueidad. </w:t>
+        <w:t>Las protecciones se limitarán a tener en el cuadro de mandos un relé diferencial, un interruptor magnetotérmico, un contactor, un salvamotor y conductores de protección.</w:t>
       </w:r>
     </w:p>
     <w:p>
@@ -8212,49 +8118,7 @@
         <w:rPr>
           <w:rFonts w:cs="Times New Roman"/>
         </w:rPr>
-        <w:t xml:space="preserve">Las protecciones se limitarán a tener en el cuadro de mandos un relé diferencial, un interruptor magnetotérmico, un contactor, un </w:t>
-      </w:r>
-      <w:proofErr w:type="spellStart"/>
-      <w:r>
-        <w:rPr>
-          <w:rFonts w:cs="Times New Roman"/>
-        </w:rPr>
-        <w:t>salvamotor</w:t>
-      </w:r>
-      <w:proofErr w:type="spellEnd"/>
-      <w:r>
-        <w:rPr>
-          <w:rFonts w:cs="Times New Roman"/>
-        </w:rPr>
-        <w:t xml:space="preserve"> y conductores de protección.</w:t>
-      </w:r>
-    </w:p>
-    <w:p>
-      <w:pPr>
-        <w:ind w:left="567"/>
-        <w:rPr>
-          <w:rFonts w:cs="Times New Roman"/>
-        </w:rPr>
-      </w:pPr>
-      <w:r>
-        <w:rPr>
-          <w:rFonts w:cs="Times New Roman"/>
-        </w:rPr>
-        <w:t xml:space="preserve">La llave del cuadro de mandos estará siempre en poder del interesado o persona de confianza y la boca del sondeo estará tapada, dando únicamente entrada por ella al cable conductor eléctrico, al cable de </w:t>
-      </w:r>
-      <w:proofErr w:type="spellStart"/>
-      <w:r>
-        <w:rPr>
-          <w:rFonts w:cs="Times New Roman"/>
-        </w:rPr>
-        <w:t>sujección</w:t>
-      </w:r>
-      <w:proofErr w:type="spellEnd"/>
-      <w:r>
-        <w:rPr>
-          <w:rFonts w:cs="Times New Roman"/>
-        </w:rPr>
-        <w:t xml:space="preserve"> de la bomba y a la tubería de impulsión del agua.</w:t>
+        <w:t>La llave del cuadro de mandos estará siempre en poder del interesado o persona de confianza y la boca del sondeo estará tapada, dando únicamente entrada por ella al cable conductor eléctrico, al cable de sujección de la bomba y a la tubería de impulsión del agua.</w:t>
       </w:r>
     </w:p>
     <w:p>
@@ -8302,7 +8166,6 @@
         </w:rPr>
         <w:t>{{</w:t>
       </w:r>
-      <w:proofErr w:type="spellStart"/>
       <w:r>
         <w:rPr>
           <w:rFonts w:cs="Times New Roman"/>
@@ -8333,7 +8196,6 @@
         </w:rPr>
         <w:t>electrica</w:t>
       </w:r>
-      <w:proofErr w:type="spellEnd"/>
       <w:r>
         <w:rPr>
           <w:rFonts w:cs="Times New Roman"/>
@@ -8403,21 +8265,21 @@
         <w:rPr>
           <w:rFonts w:cs="Times New Roman"/>
         </w:rPr>
-        <w:t xml:space="preserve">Cubierta de neopreno (mezcla elástica vulcanizada de </w:t>
-      </w:r>
-      <w:proofErr w:type="spellStart"/>
-      <w:r>
+        <w:t>Cubierta de neopreno (mezcla elástica vulcanizada de policloropreno).</w:t>
+      </w:r>
+    </w:p>
+    <w:p>
+      <w:pPr>
+        <w:ind w:left="567"/>
         <w:rPr>
           <w:rFonts w:cs="Times New Roman"/>
         </w:rPr>
-        <w:t>policloropreno</w:t>
-      </w:r>
-      <w:proofErr w:type="spellEnd"/>
+      </w:pPr>
       <w:r>
         <w:rPr>
           <w:rFonts w:cs="Times New Roman"/>
         </w:rPr>
-        <w:t>).</w:t>
+        <w:t xml:space="preserve">La línea de baja tensión será aérea o enterrada, pero siempre de acuerdo con los condicionantes e indicaciones de la normativa de aplicación anteriormente reseñada. </w:t>
       </w:r>
     </w:p>
     <w:p>
@@ -8431,41 +8293,13 @@
         <w:rPr>
           <w:rFonts w:cs="Times New Roman"/>
         </w:rPr>
-        <w:t xml:space="preserve">La línea de baja tensión será aérea o enterrada, pero siempre de acuerdo con los condicionantes e indicaciones de la normativa de aplicación anteriormente reseñada. </w:t>
-      </w:r>
-    </w:p>
-    <w:p>
-      <w:pPr>
-        <w:ind w:left="567"/>
+        <w:t>Por otra parte, será aconsejable la instalación de uno o varios cuadros generales y de protección que incluirán, como recomendación, la siguiente apar</w:t>
+      </w:r>
+      <w:r>
         <w:rPr>
           <w:rFonts w:cs="Times New Roman"/>
         </w:rPr>
-      </w:pPr>
-      <w:r>
-        <w:rPr>
-          <w:rFonts w:cs="Times New Roman"/>
-        </w:rPr>
-        <w:t xml:space="preserve">Por otra parte, será aconsejable la instalación de uno o varios cuadros generales y de protección que incluirán, como recomendación, la siguiente </w:t>
-      </w:r>
-      <w:proofErr w:type="spellStart"/>
-      <w:r>
-        <w:rPr>
-          <w:rFonts w:cs="Times New Roman"/>
-        </w:rPr>
-        <w:t>apar</w:t>
-      </w:r>
-      <w:r>
-        <w:rPr>
-          <w:rFonts w:cs="Times New Roman"/>
-        </w:rPr>
-        <w:t>amenta</w:t>
-      </w:r>
-      <w:proofErr w:type="spellEnd"/>
-      <w:r>
-        <w:rPr>
-          <w:rFonts w:cs="Times New Roman"/>
-        </w:rPr>
-        <w:t xml:space="preserve"> eléctrica y componentes:</w:t>
+        <w:t>amenta eléctrica y componentes:</w:t>
       </w:r>
     </w:p>
     <w:p>
@@ -8717,21 +8551,7 @@
           <w:rFonts w:cs="Times New Roman"/>
         </w:rPr>
         <w:tab/>
-        <w:t xml:space="preserve">Cubierta de neopreno (mezcla elástica vulcanizada de </w:t>
-      </w:r>
-      <w:proofErr w:type="spellStart"/>
-      <w:r>
-        <w:rPr>
-          <w:rFonts w:cs="Times New Roman"/>
-        </w:rPr>
-        <w:t>policloropreno</w:t>
-      </w:r>
-      <w:proofErr w:type="spellEnd"/>
-      <w:r>
-        <w:rPr>
-          <w:rFonts w:cs="Times New Roman"/>
-        </w:rPr>
-        <w:t>).</w:t>
+        <w:t>Cubierta de neopreno (mezcla elástica vulcanizada de policloropreno).</w:t>
       </w:r>
     </w:p>
     <w:p>
@@ -8798,7 +8618,6 @@
         </w:rPr>
         <w:t>{{</w:t>
       </w:r>
-      <w:proofErr w:type="spellStart"/>
       <w:r>
         <w:rPr>
           <w:rFonts w:cs="Times New Roman"/>
@@ -8806,7 +8625,6 @@
         </w:rPr>
         <w:t>PH_Consumo</w:t>
       </w:r>
-      <w:proofErr w:type="spellEnd"/>
       <w:r>
         <w:rPr>
           <w:rFonts w:cs="Times New Roman"/>
@@ -8899,33 +8717,31 @@
         <w:rPr>
           <w:rFonts w:cs="Times New Roman"/>
         </w:rPr>
-        <w:t xml:space="preserve"> una bomba </w:t>
-      </w:r>
-      <w:proofErr w:type="spellStart"/>
+        <w:t xml:space="preserve"> una bomba electrosumergible</w:t>
+      </w:r>
       <w:r>
         <w:rPr>
           <w:rFonts w:cs="Times New Roman"/>
         </w:rPr>
-        <w:t>electrosumergible</w:t>
-      </w:r>
-      <w:proofErr w:type="spellEnd"/>
+        <w:t xml:space="preserve"> </w:t>
+      </w:r>
       <w:r>
         <w:rPr>
           <w:rFonts w:cs="Times New Roman"/>
         </w:rPr>
-        <w:t xml:space="preserve"> </w:t>
+        <w:t xml:space="preserve">de </w:t>
       </w:r>
       <w:r>
         <w:rPr>
           <w:rFonts w:cs="Times New Roman"/>
         </w:rPr>
-        <w:t xml:space="preserve">de </w:t>
+        <w:t xml:space="preserve">Electrobomba Sumergible </w:t>
       </w:r>
       <w:r>
         <w:rPr>
           <w:rFonts w:cs="Times New Roman"/>
         </w:rPr>
-        <w:t xml:space="preserve">Electrobomba Sumergible </w:t>
+        <w:t>{</w:t>
       </w:r>
       <w:r>
         <w:rPr>
@@ -8937,21 +8753,7 @@
         <w:rPr>
           <w:rFonts w:cs="Times New Roman"/>
         </w:rPr>
-        <w:t>{</w:t>
-      </w:r>
-      <w:proofErr w:type="spellStart"/>
-      <w:r>
-        <w:rPr>
-          <w:rFonts w:cs="Times New Roman"/>
-        </w:rPr>
-        <w:t>potencia_bombeo_kw</w:t>
-      </w:r>
-      <w:proofErr w:type="spellEnd"/>
-      <w:r>
-        <w:rPr>
-          <w:rFonts w:cs="Times New Roman"/>
-        </w:rPr>
-        <w:t>}}</w:t>
+        <w:t>potencia_bombeo_kw}}</w:t>
       </w:r>
       <w:r>
         <w:rPr>
@@ -9049,21 +8851,7 @@
         <w:rPr>
           <w:rFonts w:cs="Times New Roman"/>
         </w:rPr>
-        <w:t xml:space="preserve">Cuando se haya finalizado la vida útil del sondeo, se procederá al tapado </w:t>
-      </w:r>
-      <w:proofErr w:type="gramStart"/>
-      <w:r>
-        <w:rPr>
-          <w:rFonts w:cs="Times New Roman"/>
-        </w:rPr>
-        <w:t>del mismo</w:t>
-      </w:r>
-      <w:proofErr w:type="gramEnd"/>
-      <w:r>
-        <w:rPr>
-          <w:rFonts w:cs="Times New Roman"/>
-        </w:rPr>
-        <w:t xml:space="preserve">, utilizando material inerte (Grava calibrada </w:t>
+        <w:t xml:space="preserve">Cuando se haya finalizado la vida útil del sondeo, se procederá al tapado del mismo, utilizando material inerte (Grava calibrada </w:t>
       </w:r>
       <w:r>
         <w:rPr>
@@ -9199,35 +8987,7 @@
         <w:rPr>
           <w:rFonts w:cs="Times New Roman"/>
         </w:rPr>
-        <w:t xml:space="preserve">Finalizada la explotación del sondeo, se retirará toda la tubería de impulsión, la bomba </w:t>
-      </w:r>
-      <w:proofErr w:type="spellStart"/>
-      <w:r>
-        <w:rPr>
-          <w:rFonts w:cs="Times New Roman"/>
-        </w:rPr>
-        <w:t>electrosumergible</w:t>
-      </w:r>
-      <w:proofErr w:type="spellEnd"/>
-      <w:r>
-        <w:rPr>
-          <w:rFonts w:cs="Times New Roman"/>
-        </w:rPr>
-        <w:t xml:space="preserve">, así como toda la </w:t>
-      </w:r>
-      <w:proofErr w:type="spellStart"/>
-      <w:r>
-        <w:rPr>
-          <w:rFonts w:cs="Times New Roman"/>
-        </w:rPr>
-        <w:t>valvulería</w:t>
-      </w:r>
-      <w:proofErr w:type="spellEnd"/>
-      <w:r>
-        <w:rPr>
-          <w:rFonts w:cs="Times New Roman"/>
-        </w:rPr>
-        <w:t xml:space="preserve"> y </w:t>
+        <w:t xml:space="preserve">Finalizada la explotación del sondeo, se retirará toda la tubería de impulsión, la bomba electrosumergible, así como toda la valvulería y </w:t>
       </w:r>
       <w:r>
         <w:rPr>
@@ -9391,14 +9151,12 @@
         </w:rPr>
         <w:t>{</w:t>
       </w:r>
-      <w:proofErr w:type="spellStart"/>
       <w:r>
         <w:rPr>
           <w:rFonts w:cs="Times New Roman"/>
         </w:rPr>
         <w:t>PH_Alternativas_Desc</w:t>
       </w:r>
-      <w:proofErr w:type="spellEnd"/>
       <w:r>
         <w:rPr>
           <w:rFonts w:cs="Times New Roman"/>
@@ -9428,11 +9186,9 @@
       <w:r>
         <w:t>{{</w:t>
       </w:r>
-      <w:proofErr w:type="spellStart"/>
       <w:r>
         <w:t>PH_Alternativas_Val</w:t>
       </w:r>
-      <w:proofErr w:type="spellEnd"/>
       <w:r>
         <w:t>}}</w:t>
       </w:r>
@@ -9453,11 +9209,9 @@
       <w:r>
         <w:t>{{</w:t>
       </w:r>
-      <w:proofErr w:type="spellStart"/>
       <w:r>
         <w:t>PH_Alternativas_Just</w:t>
       </w:r>
-      <w:proofErr w:type="spellEnd"/>
       <w:r>
         <w:t>}}</w:t>
       </w:r>
@@ -9580,21 +9334,7 @@
         <w:rPr>
           <w:rFonts w:cs="Times New Roman"/>
         </w:rPr>
-        <w:t>{{</w:t>
-      </w:r>
-      <w:proofErr w:type="spellStart"/>
-      <w:r>
-        <w:rPr>
-          <w:rFonts w:cs="Times New Roman"/>
-        </w:rPr>
-        <w:t>PH_usos_actuales</w:t>
-      </w:r>
-      <w:proofErr w:type="spellEnd"/>
-      <w:r>
-        <w:rPr>
-          <w:rFonts w:cs="Times New Roman"/>
-        </w:rPr>
-        <w:t>}}</w:t>
+        <w:t>{{PH_usos_actuales}}</w:t>
       </w:r>
     </w:p>
     <w:p>
@@ -9737,21 +9477,13 @@
     </w:p>
     <w:p>
       <w:r>
-        <w:t>{{</w:t>
-      </w:r>
-      <w:proofErr w:type="spellStart"/>
-      <w:r>
-        <w:t>geolog</w:t>
+        <w:t>{{geolog</w:t>
       </w:r>
       <w:r>
         <w:t>i</w:t>
       </w:r>
       <w:r>
-        <w:t>a</w:t>
-      </w:r>
-      <w:proofErr w:type="spellEnd"/>
-      <w:r>
-        <w:t>}}</w:t>
+        <w:t>a}}</w:t>
       </w:r>
     </w:p>
     <w:p>
@@ -10972,23 +10704,20 @@
         </w:numPr>
       </w:pPr>
       <w:r>
-        <w:t>Ruido: Al realizar las distintas actividades de obras, se producirán ruidos, debido a las máquinas que realizan la perforación y transporte de materiales. Estos ruidos influirán de forma desfavorable en el medio. Quizás a quien más podría molestar es a la población y se considera poco relevante dado que la f</w:t>
-      </w:r>
-      <w:r>
-        <w:t xml:space="preserve">inca se encuentra a más de </w:t>
-      </w:r>
-      <w:r>
-        <w:t>3</w:t>
-      </w:r>
-      <w:r>
-        <w:t>00</w:t>
-      </w:r>
-      <w:r>
-        <w:t xml:space="preserve"> m del núcleo de población más cercano. Los ruidos también pueden molestar a la fauna de la zona, pero no se considera relevante, por el poco tiempo que se tiene previsto que duren las obras. La calificación del impacto es negativa, de efecto directo, pero sin sinergismo, con un impacto temporal, desapareciendo </w:t>
+        <w:t xml:space="preserve">Ruido: </w:t>
+      </w:r>
+      <w:r>
+        <w:t>Durante la ejecución de las actividades de obra se generarán ruidos procedentes del funcionamiento de maquinaria y del transporte de materiales. Estos ruidos tendrán una incidencia desfavorable sobre el medio, principalmente por la alteración acústica temporal que pueden causar en el entorno. No obstante, el impacto se considera poco relevante debido a la corta duración prevista de las obras y a la localización de la actuación, generalmente alejada de zonas residenciales o sensibles.</w:t>
+      </w:r>
+      <w:r>
+        <w:t xml:space="preserve"> </w:t>
+      </w:r>
+      <w:r>
+        <w:t xml:space="preserve">La calificación del impacto es negativa, de efecto directo, sin sinergismo, de carácter temporal, recuperable y reversible, </w:t>
       </w:r>
       <w:r>
         <w:lastRenderedPageBreak/>
-        <w:t>en el momento de terminar las labores de obra, lo que supone también una caracterización de impacto como recuperable y reversible. El dictamen y valoración del impacto es de admisible y compatible con el medio, debido sobre todo a la poca duración del impacto y a la ubicación de la parcela.</w:t>
+        <w:t>desapareciendo al finalizar las labores de obra. El dictamen y valoración del impacto es de admisible y compatible con el medio, dado su bajo alcance y duración limitada.</w:t>
       </w:r>
     </w:p>
     <w:p>
@@ -11237,7 +10966,13 @@
         </w:numPr>
       </w:pPr>
       <w:r>
-        <w:t xml:space="preserve">Empleo: todas las actividades que se realicen para llevar a cabo un proyecto ya sea de las dimensiones que sea la inversión, tiene un efecto sobre el empleo y la economía de una forma positiva, pudiendo dar trabajo temporal a personas o empresas de construcción de la zona.  Por lo que se considera el impacto positivo, con una incidencia directa y localizada en la población del municipio o de su entorno. Y se dictamina y valora como admisible y compatible con el medio social. </w:t>
+        <w:t xml:space="preserve">Empleo: todas las actividades que se realicen para llevar a cabo un proyecto ya sea de las dimensiones que sea la inversión, tiene un efecto sobre el empleo y la economía de una forma positiva, pudiendo dar trabajo temporal a personas o empresas de construcción de la zona.  Por lo que se considera el impacto positivo, con una incidencia directa y localizada en la población del municipio o de su entorno. </w:t>
+      </w:r>
+      <w:r>
+        <w:t>S</w:t>
+      </w:r>
+      <w:r>
+        <w:t xml:space="preserve">e dictamina y valora como admisible y compatible con el medio social. </w:t>
       </w:r>
     </w:p>
     <w:p>
@@ -11260,15 +10995,7 @@
         <w:t>, si durante la ejecución de las obras, apareciera algún yacimiento arqueológico, como medida preventiva</w:t>
       </w:r>
       <w:r>
-        <w:t xml:space="preserve"> se establecerá una protección </w:t>
-      </w:r>
-      <w:proofErr w:type="gramStart"/>
-      <w:r>
-        <w:t>del mismo</w:t>
-      </w:r>
-      <w:proofErr w:type="gramEnd"/>
-      <w:r>
-        <w:t xml:space="preserve">. </w:t>
+        <w:t xml:space="preserve"> se establecerá una protección del mismo. </w:t>
       </w:r>
     </w:p>
     <w:p>
@@ -11304,20 +11031,13 @@
       <w:bookmarkEnd w:id="48"/>
     </w:p>
     <w:p>
-      <w:r>
-        <w:t xml:space="preserve">En el desarrollo de la actividad </w:t>
-      </w:r>
-      <w:r>
-        <w:t>de abastecimiento de agua</w:t>
-      </w:r>
-      <w:r>
-        <w:t xml:space="preserve"> se modificará el nivel freático por la extracción de aguas para </w:t>
-      </w:r>
-      <w:r>
-        <w:t>consumo de la población</w:t>
-      </w:r>
-      <w:r>
-        <w:t xml:space="preserve">.  Se considera un efecto negativo, directo, no sinérgico, permanente, localizado e irreversible. Teniendo en cuenta que se cumplirá con las normativas establecidas para la captación de agua en cuanto a volumen de extracción se dictamina el efecto como admisible y valora como moderado sobre el medio. </w:t>
+      <w:pPr>
+        <w:rPr>
+          <w:u w:val="single"/>
+        </w:rPr>
+      </w:pPr>
+      <w:r>
+        <w:t>En el desarrollo de la actividad se producirá una modificación del nivel freático debido a la extracción o aprovechamiento de aguas subterráneas. Se considera un efecto negativo, directo, no sinérgico, permanente, localizado e irreversible. Teniendo en cuenta que se cumplirá con la normativa vigente en materia de captación y aprovechamiento de recursos hídricos, se dictamina el efecto como admisible y se valora como moderado sobre el medio.</w:t>
       </w:r>
     </w:p>
     <w:p>
@@ -11468,49 +11188,19 @@
         <w:t>Población</w:t>
       </w:r>
       <w:r>
-        <w:t>. La</w:t>
-      </w:r>
-      <w:r>
-        <w:t xml:space="preserve"> </w:t>
-      </w:r>
-      <w:r>
-        <w:t>actividad</w:t>
-      </w:r>
-      <w:r>
-        <w:t xml:space="preserve"> de extracción de aguas </w:t>
-      </w:r>
-      <w:r>
-        <w:t>subterráneas</w:t>
-      </w:r>
-      <w:r>
-        <w:t xml:space="preserve"> tiene un alto grado de aceptación en la población de la zona, debido a que es la base fundamental de vida de sus habitantes</w:t>
-      </w:r>
-      <w:r>
-        <w:t>, pues disponer de agua potable en los domicilios hoy en día es un aspecto básico.</w:t>
-      </w:r>
-      <w:r>
-        <w:t xml:space="preserve"> </w:t>
-      </w:r>
-      <w:r>
-        <w:t>S</w:t>
-      </w:r>
-      <w:r>
-        <w:t xml:space="preserve">e debe considerar al igual que en este </w:t>
-      </w:r>
-      <w:r>
-        <w:t xml:space="preserve">caso como un efecto positivo, directo sobre </w:t>
-      </w:r>
-      <w:r>
-        <w:t>la población</w:t>
-      </w:r>
-      <w:r>
-        <w:t>, temporal, y con una valoració</w:t>
-      </w:r>
-      <w:r>
-        <w:t>n y dictamen del impacto como admisib</w:t>
-      </w:r>
-      <w:r>
-        <w:t xml:space="preserve">le y compatible. </w:t>
+        <w:t xml:space="preserve">. </w:t>
+      </w:r>
+      <w:r>
+        <w:t>{</w:t>
+      </w:r>
+      <w:r>
+        <w:t>{</w:t>
+      </w:r>
+      <w:r>
+        <w:t>impacto_poblacion}</w:t>
+      </w:r>
+      <w:r>
+        <w:t>}</w:t>
       </w:r>
     </w:p>
     <w:p>
@@ -11675,7 +11365,6 @@
       <w:bookmarkStart w:id="65" w:name="_Toc14806472"/>
       <w:bookmarkStart w:id="66" w:name="_Toc201420806"/>
       <w:r>
-        <w:lastRenderedPageBreak/>
         <w:t>Flora</w:t>
       </w:r>
       <w:bookmarkEnd w:id="65"/>
@@ -11697,7 +11386,11 @@
         <w:t>instalaciones</w:t>
       </w:r>
       <w:r>
-        <w:t xml:space="preserve"> producirá un efecto negativo sobre la flora de la parcela, al igual que lo es el paso de la maquinaria necesaria para realizar las obras, este se caracterizará como negativo y directo; de carácter temporal porque en cuanto acaben las obras se volverá a su estado natural y por lo tanto recuperable y reversible. El dictamen y valoración para este efecto es admisible y compatible con el medio.</w:t>
+        <w:t xml:space="preserve"> producirá un efecto negativo sobre la flora de la parcela, al igual que lo es el paso de la maquinaria necesaria para realizar las obras, este se caracterizará como negativo y directo; de carácter temporal porque en cuanto acaben las obras se volverá a su estado natural y por lo tanto recuperable </w:t>
+      </w:r>
+      <w:r>
+        <w:lastRenderedPageBreak/>
+        <w:t>y reversible. El dictamen y valoración para este efecto es admisible y compatible con el medio.</w:t>
       </w:r>
     </w:p>
     <w:p>
@@ -30212,15 +29905,7 @@
         <w:t xml:space="preserve"> (2013)</w:t>
       </w:r>
       <w:r>
-        <w:t xml:space="preserve"> se considera esta masa como en buen estado general por no encontrarse alteraciones relevantes que afecten a la totalidad de </w:t>
-      </w:r>
-      <w:proofErr w:type="gramStart"/>
-      <w:r>
-        <w:t>la misma</w:t>
-      </w:r>
-      <w:proofErr w:type="gramEnd"/>
-      <w:r>
-        <w:t>.</w:t>
+        <w:t xml:space="preserve"> se considera esta masa como en buen estado general por no encontrarse alteraciones relevantes que afecten a la totalidad de la misma.</w:t>
       </w:r>
       <w:r>
         <w:t xml:space="preserve"> A </w:t>
@@ -30508,13 +30193,8 @@
         </w:numPr>
         <w:spacing w:before="120" w:after="0" w:line="240" w:lineRule="auto"/>
       </w:pPr>
-      <w:proofErr w:type="spellStart"/>
-      <w:r>
-        <w:t>Metasedimentos</w:t>
-      </w:r>
-      <w:proofErr w:type="spellEnd"/>
-      <w:r>
-        <w:t xml:space="preserve"> ordovícicos (areniscas y pizarras): Se trata de formaciones arenosas intensamente fracturadas, lo que otorga a estos materiales permeabilidades medias a altas. En zonas de contacto con unidades pizarrosas, pueden aparecer surgencias y manantiales que proporcionan caudales moderados, especialmente en áreas de relieve favorable.</w:t>
+      <w:r>
+        <w:t>Metasedimentos ordovícicos (areniscas y pizarras): Se trata de formaciones arenosas intensamente fracturadas, lo que otorga a estos materiales permeabilidades medias a altas. En zonas de contacto con unidades pizarrosas, pueden aparecer surgencias y manantiales que proporcionan caudales moderados, especialmente en áreas de relieve favorable.</w:t>
       </w:r>
     </w:p>
     <w:p>
@@ -30550,15 +30230,7 @@
         <w:t xml:space="preserve"> </w:t>
       </w:r>
       <w:r>
-        <w:t xml:space="preserve">Estos materiales rellenan una fosa tectónica con dirección preferente sudoeste-noreste (SW-NE). Están compuestos por conglomerados y </w:t>
-      </w:r>
-      <w:proofErr w:type="spellStart"/>
-      <w:r>
-        <w:t>arcósas</w:t>
-      </w:r>
-      <w:proofErr w:type="spellEnd"/>
-      <w:r>
-        <w:t xml:space="preserve"> con grados de cementación variables. Se distinguen dos niveles principales:</w:t>
+        <w:t>Estos materiales rellenan una fosa tectónica con dirección preferente sudoeste-noreste (SW-NE). Están compuestos por conglomerados y arcósas con grados de cementación variables. Se distinguen dos niveles principales:</w:t>
       </w:r>
     </w:p>
     <w:p>
@@ -30570,15 +30242,7 @@
         <w:spacing w:before="120" w:after="0" w:line="240" w:lineRule="auto"/>
       </w:pPr>
       <w:r>
-        <w:t xml:space="preserve">Un tramo basal constituido por gravas y arenas </w:t>
-      </w:r>
-      <w:proofErr w:type="spellStart"/>
-      <w:r>
-        <w:t>arcósicas</w:t>
-      </w:r>
-      <w:proofErr w:type="spellEnd"/>
-      <w:r>
-        <w:t>, con permeabilidad moderada a alta, dependiendo del grado de consolidación.</w:t>
+        <w:t>Un tramo basal constituido por gravas y arenas arcósicas, con permeabilidad moderada a alta, dependiendo del grado de consolidación.</w:t>
       </w:r>
     </w:p>
     <w:p>
@@ -30893,27 +30557,14 @@
       </w:r>
     </w:p>
     <w:p>
-      <w:proofErr w:type="gramStart"/>
-      <w:r>
-        <w:t>Las sustancias a emplear</w:t>
-      </w:r>
-      <w:proofErr w:type="gramEnd"/>
-      <w:r>
-        <w:t xml:space="preserve"> en la obra son propias de cualquier vehículo motriz autopropulsado,</w:t>
+      <w:r>
+        <w:t>Las sustancias a emplear en la obra son propias de cualquier vehículo motriz autopropulsado,</w:t>
       </w:r>
       <w:r>
         <w:t xml:space="preserve"> no considerándose estas como sustancias peligrosas,</w:t>
       </w:r>
       <w:r>
-        <w:t xml:space="preserve"> por lo </w:t>
-      </w:r>
-      <w:proofErr w:type="gramStart"/>
-      <w:r>
-        <w:t>que</w:t>
-      </w:r>
-      <w:proofErr w:type="gramEnd"/>
-      <w:r>
-        <w:t xml:space="preserve"> en caso de vertido o derrame, se procederá a la descontaminación de la zona, mediante empresa gestora autorizada. Dicho accidente anteriormente descrito es el único contemplado en un proyecto de estas características.</w:t>
+        <w:t xml:space="preserve"> por lo que en caso de vertido o derrame, se procederá a la descontaminación de la zona, mediante empresa gestora autorizada. Dicho accidente anteriormente descrito es el único contemplado en un proyecto de estas características.</w:t>
       </w:r>
     </w:p>
     <w:p>
@@ -31280,13 +30931,8 @@
       </w:r>
     </w:p>
     <w:p>
-      <w:proofErr w:type="gramStart"/>
-      <w:r>
-        <w:t>Toda la maquinaria a utilizar</w:t>
-      </w:r>
-      <w:proofErr w:type="gramEnd"/>
-      <w:r>
-        <w:t xml:space="preserve"> cumplirá la normativa vigente en lo que concierne a la protección de medio ambiente, producción de humos y ruidos. El repostaje de la maquinaria se ejecutará fuera de la zona, con los medios y en lugar adecuado.</w:t>
+      <w:r>
+        <w:t>Toda la maquinaria a utilizar cumplirá la normativa vigente en lo que concierne a la protección de medio ambiente, producción de humos y ruidos. El repostaje de la maquinaria se ejecutará fuera de la zona, con los medios y en lugar adecuado.</w:t>
       </w:r>
       <w:r>
         <w:rPr>
@@ -31658,17 +31304,8 @@
           <w:i/>
           <w:iCs/>
         </w:rPr>
-        <w:t xml:space="preserve">Quercus </w:t>
-      </w:r>
-      <w:proofErr w:type="spellStart"/>
-      <w:r>
-        <w:rPr>
-          <w:i/>
-          <w:iCs/>
-        </w:rPr>
-        <w:t>pyrenaica</w:t>
-      </w:r>
-      <w:proofErr w:type="spellEnd"/>
+        <w:t>Quercus pyrenaica</w:t>
+      </w:r>
       <w:r>
         <w:t xml:space="preserve"> (roble melojo) en el perímetro de la zona de actuación, contribuyendo a la restauración paisajística y a la mejora del hábitat en la interfaz agrícola-urbana. Esta acción se desarrollará en el entorno inmediato del sondeo, especialmente en la zona de acceso afectada por la maquinaria.</w:t>
       </w:r>
@@ -31777,23 +31414,7 @@
     </w:p>
     <w:p>
       <w:r>
-        <w:t xml:space="preserve">El principal objetivo del </w:t>
-      </w:r>
-      <w:proofErr w:type="gramStart"/>
-      <w:r>
-        <w:t>PVA,</w:t>
-      </w:r>
-      <w:proofErr w:type="gramEnd"/>
-      <w:r>
-        <w:t xml:space="preserve"> es el de velar </w:t>
-      </w:r>
-      <w:proofErr w:type="gramStart"/>
-      <w:r>
-        <w:t>para</w:t>
-      </w:r>
-      <w:proofErr w:type="gramEnd"/>
-      <w:r>
-        <w:t xml:space="preserve"> que el proyecto o la actividad que se someta a control se lleve a término según los condicionantes ambientales impuestos por la administración. </w:t>
+        <w:t xml:space="preserve">El principal objetivo del PVA, es el de velar para que el proyecto o la actividad que se someta a control se lleve a término según los condicionantes ambientales impuestos por la administración. </w:t>
       </w:r>
     </w:p>
     <w:p>
@@ -33060,23 +32681,7 @@
         <w:rFonts w:ascii="Arial" w:hAnsi="Arial" w:cs="Arial"/>
         <w:sz w:val="16"/>
       </w:rPr>
-      <w:t xml:space="preserve">Pl. San Cristóbal </w:t>
-    </w:r>
-    <w:proofErr w:type="spellStart"/>
-    <w:r>
-      <w:rPr>
-        <w:rFonts w:ascii="Arial" w:hAnsi="Arial" w:cs="Arial"/>
-        <w:sz w:val="16"/>
-      </w:rPr>
-      <w:t>nº</w:t>
-    </w:r>
-    <w:proofErr w:type="spellEnd"/>
-    <w:r>
-      <w:rPr>
-        <w:rFonts w:ascii="Arial" w:hAnsi="Arial" w:cs="Arial"/>
-        <w:sz w:val="16"/>
-      </w:rPr>
-      <w:t xml:space="preserve"> 6, 37001 </w:t>
+      <w:t xml:space="preserve">Pl. San Cristóbal nº 6, 37001 </w:t>
     </w:r>
     <w:r>
       <w:rPr>

</xml_diff>

<commit_message>
logré que se exportaran bien tanto los encabezados como todos los ph
</commit_message>
<xml_diff>
--- a/plantilla_EIA.docx
+++ b/plantilla_EIA.docx
@@ -6790,6 +6790,34 @@
       </w:r>
     </w:p>
     <w:p>
+      <w:r>
+        <w:t>En la actualidad existe abierto un expediente con</w:t>
+      </w:r>
+      <w:r>
+        <w:t xml:space="preserve"> la Sección de Minas, del servicio territorial de Industria, Comercio y Economía de la Delegación Territorial de la Junta de Castilla y León en Ávila.</w:t>
+      </w:r>
+      <w:r>
+        <w:t xml:space="preserve"> </w:t>
+      </w:r>
+      <w:r>
+        <w:t xml:space="preserve">Dicho expediente está matriculado con el número de referencia </w:t>
+      </w:r>
+      <w:proofErr w:type="spellStart"/>
+      <w:r>
+        <w:t>Exp</w:t>
+      </w:r>
+      <w:proofErr w:type="spellEnd"/>
+      <w:r>
+        <w:t xml:space="preserve"> Minas: </w:t>
+      </w:r>
+      <w:r>
+        <w:rPr>
+          <w:color w:val="EE0000"/>
+        </w:rPr>
+        <w:t>AG-056/23</w:t>
+      </w:r>
+    </w:p>
+    <w:p>
       <w:pPr>
         <w:rPr>
           <w:rFonts w:ascii="Consolas" w:eastAsia="Times New Roman" w:hAnsi="Consolas" w:cs="Times New Roman"/>
@@ -6817,30 +6845,43 @@
       <w:r>
         <w:t>{{</w:t>
       </w:r>
-      <w:r>
-        <w:t>profundidad</w:t>
-      </w:r>
-      <w:r>
-        <w:t xml:space="preserve">}} </w:t>
-      </w:r>
-      <w:r>
-        <w:t xml:space="preserve">m profundidad y </w:t>
-      </w:r>
-      <w:r>
-        <w:t>perforación de {{</w:t>
-      </w:r>
       <w:proofErr w:type="spellStart"/>
       <w:proofErr w:type="gramStart"/>
       <w:r>
+        <w:t>parametros.profundidad</w:t>
+      </w:r>
+      <w:proofErr w:type="gramEnd"/>
+      <w:r>
+        <w:t>_proyectada_m</w:t>
+      </w:r>
+      <w:proofErr w:type="spellEnd"/>
+      <w:r>
+        <w:t xml:space="preserve">}} </w:t>
+      </w:r>
+      <w:r>
+        <w:t xml:space="preserve">m profundidad y </w:t>
+      </w:r>
+      <w:r>
+        <w:t xml:space="preserve">perforación de </w:t>
+      </w:r>
+      <w:r>
+        <w:t>{{</w:t>
+      </w:r>
+      <w:proofErr w:type="spellStart"/>
+      <w:proofErr w:type="gramStart"/>
+      <w:r>
         <w:t>parametros.diametro</w:t>
       </w:r>
       <w:proofErr w:type="gramEnd"/>
       <w:r>
-        <w:t>_perforacion_definitivo_mm</w:t>
+        <w:t>_perforacion_inicial_mm</w:t>
       </w:r>
       <w:proofErr w:type="spellEnd"/>
       <w:r>
-        <w:t>}}</w:t>
+        <w:t>}</w:t>
+      </w:r>
+      <w:r>
+        <w:t>}</w:t>
       </w:r>
       <w:r>
         <w:t xml:space="preserve"> mm de di</w:t>
@@ -7180,6 +7221,9 @@
             <w:pPr>
               <w:spacing w:after="160"/>
               <w:jc w:val="center"/>
+              <w:rPr>
+                <w:u w:val="single"/>
+              </w:rPr>
             </w:pPr>
             <w:r>
               <w:t xml:space="preserve">X = </w:t>
@@ -8149,47 +8193,43 @@
         <w:t>{{</w:t>
       </w:r>
       <w:proofErr w:type="spellStart"/>
+      <w:proofErr w:type="gramStart"/>
       <w:r>
         <w:rPr>
           <w:rFonts w:cs="Times New Roman"/>
         </w:rPr>
-        <w:t>caudal_</w:t>
-      </w:r>
+        <w:t>parametros.caudal</w:t>
+      </w:r>
+      <w:proofErr w:type="gramEnd"/>
       <w:r>
         <w:rPr>
           <w:rFonts w:cs="Times New Roman"/>
         </w:rPr>
-        <w:t>max_instantaneo</w:t>
-      </w:r>
+        <w:t>_max_instantaneo_l_s</w:t>
+      </w:r>
+      <w:proofErr w:type="spellEnd"/>
       <w:r>
         <w:rPr>
           <w:rFonts w:cs="Times New Roman"/>
         </w:rPr>
-        <w:t>_l_s</w:t>
-      </w:r>
-      <w:proofErr w:type="spellEnd"/>
+        <w:t>}}</w:t>
+      </w:r>
       <w:r>
         <w:rPr>
           <w:rFonts w:cs="Times New Roman"/>
         </w:rPr>
-        <w:t>}}</w:t>
+        <w:t xml:space="preserve"> </w:t>
       </w:r>
       <w:r>
         <w:rPr>
           <w:rFonts w:cs="Times New Roman"/>
         </w:rPr>
-        <w:t xml:space="preserve"> </w:t>
-      </w:r>
-      <w:r>
-        <w:rPr>
-          <w:rFonts w:cs="Times New Roman"/>
-        </w:rPr>
         <w:t>l/s.</w:t>
       </w:r>
     </w:p>
     <w:p>
       <w:pPr>
-        <w:ind w:left="567"/>
+        <w:ind w:left="708" w:hanging="141"/>
         <w:rPr>
           <w:rFonts w:cs="Times New Roman"/>
         </w:rPr>
@@ -8940,11 +8980,19 @@
         <w:t>{</w:t>
       </w:r>
       <w:proofErr w:type="spellStart"/>
+      <w:proofErr w:type="gramStart"/>
       <w:r>
         <w:rPr>
           <w:rFonts w:cs="Times New Roman"/>
         </w:rPr>
-        <w:t>potencia_bombeo_kw</w:t>
+        <w:t>parametros.potencia</w:t>
+      </w:r>
+      <w:proofErr w:type="gramEnd"/>
+      <w:r>
+        <w:rPr>
+          <w:rFonts w:cs="Times New Roman"/>
+        </w:rPr>
+        <w:t>_bombeo_kw</w:t>
       </w:r>
       <w:proofErr w:type="spellEnd"/>
       <w:r>
@@ -11767,6 +11815,9 @@
         <w:t>{{</w:t>
       </w:r>
       <w:proofErr w:type="spellStart"/>
+      <w:r>
+        <w:t>impacto_</w:t>
+      </w:r>
       <w:r>
         <w:t>cese_social</w:t>
       </w:r>
@@ -32986,7 +33037,7 @@
                                   </pic:cNvPicPr>
                                 </pic:nvPicPr>
                                 <pic:blipFill>
-                                  <a:blip r:embed="rId1">
+                                  <a:blip r:embed="rId2">
                                     <a:extLst>
                                       <a:ext uri="{28A0092B-C50C-407E-A947-70E740481C1C}">
                                         <a14:useLocalDpi xmlns:a14="http://schemas.microsoft.com/office/drawing/2010/main" val="0"/>
@@ -33319,7 +33370,16 @@
         <w:sz w:val="14"/>
         <w:lang w:val="es-ES"/>
       </w:rPr>
-      <w:t>PARA CAPTACIÓN DE AGUAS SUBTERRÁNEAS PARA ABASTECIMIENTO EN {{municipio}} ({{provincia}})</w:t>
+      <w:t xml:space="preserve">PARA CAPTACIÓN DE AGUAS SUBTERRÁNEAS PARA ABASTECIMIENTO EN </w:t>
+    </w:r>
+    <w:r>
+      <w:rPr>
+        <w:rFonts w:ascii="Arial" w:hAnsi="Arial" w:cs="Arial"/>
+        <w:caps/>
+        <w:sz w:val="14"/>
+        <w:lang w:val="es-ES"/>
+      </w:rPr>
+      <w:t>{{municipio}} ({{provincia}})</w:t>
     </w:r>
   </w:p>
 </w:hdr>
@@ -33338,6 +33398,7 @@
       <w:ind w:left="-567" w:firstLine="0"/>
       <w:jc w:val="center"/>
       <w:rPr>
+        <w:caps/>
         <w:lang w:val="es-ES"/>
       </w:rPr>
     </w:pPr>
@@ -33498,38 +33559,25 @@
     <w:r>
       <w:rPr>
         <w:rFonts w:ascii="Arial" w:hAnsi="Arial" w:cs="Arial"/>
+        <w:caps/>
         <w:sz w:val="14"/>
         <w:lang w:val="es-ES"/>
       </w:rPr>
-      <w:t xml:space="preserve">EVALUACION DE IMPACTO AMBIENTAL SIMPLIIFICADA SOBRE PROYECTO DE SONDEO PARA CAPTACIÓN DE AGUAS SUBTERRÁNEAS </w:t>
+      <w:t xml:space="preserve">EVALUACION DE IMPACTO AMBIENTAL SIMPLIIFICADA SOBRE PROYECTO DE SONDEO PARA CAPTACIÓN DE AGUAS SUBTERRÁNEAS PARA ABASTECIMIENTO EN </w:t>
     </w:r>
     <w:r>
       <w:rPr>
         <w:rFonts w:ascii="Arial" w:hAnsi="Arial" w:cs="Arial"/>
+        <w:caps/>
         <w:sz w:val="14"/>
         <w:lang w:val="es-ES"/>
       </w:rPr>
-      <w:t xml:space="preserve">PARA ABASTECIMIENTO EN </w:t>
+      <w:t>{{municipio}}</w:t>
     </w:r>
     <w:r>
       <w:rPr>
         <w:rFonts w:ascii="Arial" w:hAnsi="Arial" w:cs="Arial"/>
-        <w:sz w:val="14"/>
-        <w:lang w:val="es-ES"/>
-      </w:rPr>
-      <w:t>CARRASCAL</w:t>
-    </w:r>
-    <w:r>
-      <w:rPr>
-        <w:rFonts w:ascii="Arial" w:hAnsi="Arial" w:cs="Arial"/>
-        <w:sz w:val="14"/>
-        <w:lang w:val="es-ES"/>
-      </w:rPr>
-      <w:t xml:space="preserve"> DEL OBISPO</w:t>
-    </w:r>
-    <w:r>
-      <w:rPr>
-        <w:rFonts w:ascii="Arial" w:hAnsi="Arial" w:cs="Arial"/>
+        <w:caps/>
         <w:sz w:val="14"/>
         <w:lang w:val="es-ES"/>
       </w:rPr>
@@ -33538,6 +33586,7 @@
     <w:r>
       <w:rPr>
         <w:rFonts w:ascii="Arial" w:hAnsi="Arial" w:cs="Arial"/>
+        <w:caps/>
         <w:sz w:val="14"/>
         <w:lang w:val="es-ES"/>
       </w:rPr>
@@ -33546,22 +33595,16 @@
     <w:r>
       <w:rPr>
         <w:rFonts w:ascii="Arial" w:hAnsi="Arial" w:cs="Arial"/>
+        <w:caps/>
         <w:sz w:val="14"/>
         <w:lang w:val="es-ES"/>
       </w:rPr>
-      <w:t>SALAMANC</w:t>
+      <w:t>{{provincia}}</w:t>
     </w:r>
     <w:r>
       <w:rPr>
         <w:rFonts w:ascii="Arial" w:hAnsi="Arial" w:cs="Arial"/>
-        <w:sz w:val="14"/>
-        <w:lang w:val="es-ES"/>
-      </w:rPr>
-      <w:t>A</w:t>
-    </w:r>
-    <w:r>
-      <w:rPr>
-        <w:rFonts w:ascii="Arial" w:hAnsi="Arial" w:cs="Arial"/>
+        <w:caps/>
         <w:sz w:val="14"/>
         <w:lang w:val="es-ES"/>
       </w:rPr>
@@ -33716,7 +33759,7 @@
         <w:sz w:val="14"/>
         <w:lang w:val="es-ES"/>
       </w:rPr>
-      <w:t xml:space="preserve">CARRASCAL DEL OBISPO </w:t>
+      <w:t>{{MUNICIPIO}}</w:t>
     </w:r>
     <w:r>
       <w:rPr>
@@ -33724,7 +33767,7 @@
         <w:sz w:val="14"/>
         <w:lang w:val="es-ES"/>
       </w:rPr>
-      <w:t>(</w:t>
+      <w:t xml:space="preserve"> </w:t>
     </w:r>
     <w:r>
       <w:rPr>
@@ -33732,15 +33775,7 @@
         <w:sz w:val="14"/>
         <w:lang w:val="es-ES"/>
       </w:rPr>
-      <w:t>SALAMANC</w:t>
-    </w:r>
-    <w:r>
-      <w:rPr>
-        <w:rFonts w:ascii="Arial" w:hAnsi="Arial" w:cs="Arial"/>
-        <w:sz w:val="14"/>
-        <w:lang w:val="es-ES"/>
-      </w:rPr>
-      <w:t>A</w:t>
+      <w:t>({{PROVINCIA}}</w:t>
     </w:r>
     <w:r>
       <w:rPr>

</xml_diff>

<commit_message>
logrado todo lo de Confederacion, ahora pruebas para que se vea la imagen de la captura de usos actuales en el word
</commit_message>
<xml_diff>
--- a/plantilla_EIA.docx
+++ b/plantilla_EIA.docx
@@ -6846,13 +6846,8 @@
         <w:t>{{</w:t>
       </w:r>
       <w:proofErr w:type="spellStart"/>
-      <w:proofErr w:type="gramStart"/>
-      <w:r>
-        <w:t>parametros.profundidad</w:t>
-      </w:r>
-      <w:proofErr w:type="gramEnd"/>
-      <w:r>
-        <w:t>_proyectada_m</w:t>
+      <w:r>
+        <w:t>parametros.profundidad_proyectada_m</w:t>
       </w:r>
       <w:proofErr w:type="spellEnd"/>
       <w:r>
@@ -6868,13 +6863,8 @@
         <w:t>{{</w:t>
       </w:r>
       <w:proofErr w:type="spellStart"/>
-      <w:proofErr w:type="gramStart"/>
-      <w:r>
-        <w:t>parametros.diametro</w:t>
-      </w:r>
-      <w:proofErr w:type="gramEnd"/>
-      <w:r>
-        <w:t>_perforacion_inicial_mm</w:t>
+      <w:r>
+        <w:t>parametros.diametro_perforacion_inicial_mm</w:t>
       </w:r>
       <w:proofErr w:type="spellEnd"/>
       <w:r>
@@ -7401,19 +7391,11 @@
         <w:t>{{</w:t>
       </w:r>
       <w:proofErr w:type="spellStart"/>
-      <w:proofErr w:type="gramStart"/>
       <w:r>
         <w:rPr>
           <w:rFonts w:cs="Times New Roman"/>
         </w:rPr>
-        <w:t>parametros.profundidad</w:t>
-      </w:r>
-      <w:proofErr w:type="gramEnd"/>
-      <w:r>
-        <w:rPr>
-          <w:rFonts w:cs="Times New Roman"/>
-        </w:rPr>
-        <w:t>_proyectada_m</w:t>
+        <w:t>parametros.profundidad_proyectada_m</w:t>
       </w:r>
       <w:proofErr w:type="spellEnd"/>
       <w:r>
@@ -7508,21 +7490,7 @@
         <w:rPr>
           <w:rFonts w:cs="Times New Roman"/>
         </w:rPr>
-        <w:t xml:space="preserve">hace de barrido de </w:t>
-      </w:r>
-      <w:proofErr w:type="gramStart"/>
-      <w:r>
-        <w:rPr>
-          <w:rFonts w:cs="Times New Roman"/>
-        </w:rPr>
-        <w:t>los mismos</w:t>
-      </w:r>
-      <w:proofErr w:type="gramEnd"/>
-      <w:r>
-        <w:rPr>
-          <w:rFonts w:cs="Times New Roman"/>
-        </w:rPr>
-        <w:t xml:space="preserve"> al exterior</w:t>
+        <w:t>hace de barrido de los mismos al exterior</w:t>
       </w:r>
       <w:r>
         <w:rPr>
@@ -8123,21 +8091,7 @@
         <w:rPr>
           <w:rFonts w:cs="Times New Roman"/>
         </w:rPr>
-        <w:t xml:space="preserve">Finalizado el sondeo se podrá proceder al aforo </w:t>
-      </w:r>
-      <w:proofErr w:type="gramStart"/>
-      <w:r>
-        <w:rPr>
-          <w:rFonts w:cs="Times New Roman"/>
-        </w:rPr>
-        <w:t>del mismo</w:t>
-      </w:r>
-      <w:proofErr w:type="gramEnd"/>
-      <w:r>
-        <w:rPr>
-          <w:rFonts w:cs="Times New Roman"/>
-        </w:rPr>
-        <w:t xml:space="preserve">. Éste se hará durante 16 horas ininterrumpidas con la bomba colocada 3 m por debajo de la última formación acuífera. Se estabilizarán niveles cada </w:t>
+        <w:t xml:space="preserve">Finalizado el sondeo se podrá proceder al aforo del mismo. Éste se hará durante 16 horas ininterrumpidas con la bomba colocada 3 m por debajo de la última formación acuífera. Se estabilizarán niveles cada </w:t>
       </w:r>
       <w:r>
         <w:rPr>
@@ -8193,19 +8147,11 @@
         <w:t>{{</w:t>
       </w:r>
       <w:proofErr w:type="spellStart"/>
-      <w:proofErr w:type="gramStart"/>
       <w:r>
         <w:rPr>
           <w:rFonts w:cs="Times New Roman"/>
         </w:rPr>
-        <w:t>parametros.caudal</w:t>
-      </w:r>
-      <w:proofErr w:type="gramEnd"/>
-      <w:r>
-        <w:rPr>
-          <w:rFonts w:cs="Times New Roman"/>
-        </w:rPr>
-        <w:t>_max_instantaneo_l_s</w:t>
+        <w:t>parametros.caudal_max_instantaneo_l_s</w:t>
       </w:r>
       <w:proofErr w:type="spellEnd"/>
       <w:r>
@@ -8980,19 +8926,11 @@
         <w:t>{</w:t>
       </w:r>
       <w:proofErr w:type="spellStart"/>
-      <w:proofErr w:type="gramStart"/>
       <w:r>
         <w:rPr>
           <w:rFonts w:cs="Times New Roman"/>
         </w:rPr>
-        <w:t>parametros.potencia</w:t>
-      </w:r>
-      <w:proofErr w:type="gramEnd"/>
-      <w:r>
-        <w:rPr>
-          <w:rFonts w:cs="Times New Roman"/>
-        </w:rPr>
-        <w:t>_bombeo_kw</w:t>
+        <w:t>parametros.potencia_bombeo_kw</w:t>
       </w:r>
       <w:proofErr w:type="spellEnd"/>
       <w:r>
@@ -9097,21 +9035,7 @@
         <w:rPr>
           <w:rFonts w:cs="Times New Roman"/>
         </w:rPr>
-        <w:t xml:space="preserve">Cuando se haya finalizado la vida útil del sondeo, se procederá al tapado </w:t>
-      </w:r>
-      <w:proofErr w:type="gramStart"/>
-      <w:r>
-        <w:rPr>
-          <w:rFonts w:cs="Times New Roman"/>
-        </w:rPr>
-        <w:t>del mismo</w:t>
-      </w:r>
-      <w:proofErr w:type="gramEnd"/>
-      <w:r>
-        <w:rPr>
-          <w:rFonts w:cs="Times New Roman"/>
-        </w:rPr>
-        <w:t xml:space="preserve">, utilizando material inerte (Grava calibrada </w:t>
+        <w:t xml:space="preserve">Cuando se haya finalizado la vida útil del sondeo, se procederá al tapado del mismo, utilizando material inerte (Grava calibrada </w:t>
       </w:r>
       <w:r>
         <w:rPr>
@@ -9636,7 +9560,13 @@
         <w:rPr>
           <w:rFonts w:cs="Times New Roman"/>
         </w:rPr>
-        <w:t>PH_usos_actuales</w:t>
+        <w:t>usos_actuales</w:t>
+      </w:r>
+      <w:r>
+        <w:rPr>
+          <w:rFonts w:cs="Times New Roman"/>
+        </w:rPr>
+        <w:t>_llm</w:t>
       </w:r>
       <w:proofErr w:type="spellEnd"/>
       <w:r>
@@ -11312,15 +11242,7 @@
         <w:t>, si durante la ejecución de las obras, apareciera algún yacimiento arqueológico, como medida preventiva</w:t>
       </w:r>
       <w:r>
-        <w:t xml:space="preserve"> se establecerá una protección </w:t>
-      </w:r>
-      <w:proofErr w:type="gramStart"/>
-      <w:r>
-        <w:t>del mismo</w:t>
-      </w:r>
-      <w:proofErr w:type="gramEnd"/>
-      <w:r>
-        <w:t xml:space="preserve">. </w:t>
+        <w:t xml:space="preserve"> se establecerá una protección del mismo. </w:t>
       </w:r>
     </w:p>
     <w:p>
@@ -11900,7 +11822,6 @@
       <w:bookmarkEnd w:id="75"/>
       <w:bookmarkEnd w:id="76"/>
     </w:p>
-    <w:p/>
     <w:tbl>
       <w:tblPr>
         <w:tblStyle w:val="Tabladecuadrcula1clara2"/>
@@ -22561,17 +22482,7 @@
                 <w:szCs w:val="18"/>
                 <w:lang w:eastAsia="es-ES"/>
               </w:rPr>
-              <w:t xml:space="preserve">MEDIO SOCIAL </w:t>
-            </w:r>
-            <w:r>
-              <w:rPr>
-                <w:rFonts w:eastAsia="Times New Roman" w:cs="Times New Roman"/>
-                <w:sz w:val="18"/>
-                <w:szCs w:val="18"/>
-                <w:lang w:eastAsia="es-ES"/>
-              </w:rPr>
-              <w:lastRenderedPageBreak/>
-              <w:t>ECONOMICO Y CULTURAL</w:t>
+              <w:t>MEDIO SOCIAL ECONOMICO Y CULTURAL</w:t>
             </w:r>
           </w:p>
         </w:tc>
@@ -22599,7 +22510,6 @@
                 <w:szCs w:val="18"/>
                 <w:lang w:eastAsia="es-ES"/>
               </w:rPr>
-              <w:lastRenderedPageBreak/>
               <w:t>Empleo</w:t>
             </w:r>
           </w:p>
@@ -24132,6 +24042,7 @@
       <w:bookmarkStart w:id="79" w:name="_Toc14806479"/>
       <w:bookmarkStart w:id="80" w:name="_Toc201420813"/>
       <w:r>
+        <w:lastRenderedPageBreak/>
         <w:t>Modelo de matriz de valoración cualitativa de impacto en fase de cese</w:t>
       </w:r>
       <w:bookmarkEnd w:id="79"/>
@@ -24140,7 +24051,6 @@
         <w:t xml:space="preserve"> </w:t>
       </w:r>
     </w:p>
-    <w:p/>
     <w:tbl>
       <w:tblPr>
         <w:tblStyle w:val="Tabladecuadrcula1clara2"/>
@@ -30032,346 +29942,24 @@
       </w:r>
     </w:p>
     <w:p>
-      <w:pPr>
-        <w:spacing w:after="0" w:line="240" w:lineRule="auto"/>
-      </w:pPr>
-      <w:r>
-        <w:t xml:space="preserve">La zona donde se sitúa el sondeo proyectado </w:t>
-      </w:r>
-      <w:r>
-        <w:t xml:space="preserve">no </w:t>
-      </w:r>
-      <w:r>
-        <w:t xml:space="preserve">pertenece </w:t>
-      </w:r>
-      <w:r>
-        <w:t>a</w:t>
-      </w:r>
-      <w:r>
-        <w:t xml:space="preserve"> </w:t>
-      </w:r>
-      <w:r>
-        <w:t>ninguna</w:t>
-      </w:r>
-      <w:r>
-        <w:t xml:space="preserve"> </w:t>
-      </w:r>
-      <w:r>
-        <w:t>U</w:t>
-      </w:r>
-      <w:r>
-        <w:t xml:space="preserve">nidad </w:t>
-      </w:r>
-      <w:r>
-        <w:t>H</w:t>
-      </w:r>
-      <w:r>
-        <w:t>idrogeológica</w:t>
-      </w:r>
-      <w:r>
-        <w:t xml:space="preserve">. </w:t>
-      </w:r>
-      <w:r>
-        <w:t>La subzona</w:t>
-      </w:r>
-      <w:r>
-        <w:t>,</w:t>
-      </w:r>
-      <w:r>
-        <w:t xml:space="preserve"> </w:t>
-      </w:r>
-      <w:r>
-        <w:t>319000</w:t>
-      </w:r>
-      <w:r>
-        <w:t>04</w:t>
-      </w:r>
-      <w:r>
-        <w:t xml:space="preserve"> </w:t>
-      </w:r>
-      <w:r>
-        <w:t>corresponde con la n°</w:t>
-      </w:r>
-      <w:r>
-        <w:t>1</w:t>
-      </w:r>
-      <w:r>
-        <w:t>3</w:t>
-      </w:r>
-      <w:r>
-        <w:t>, denominada "</w:t>
-      </w:r>
-      <w:r>
-        <w:t>Águeda</w:t>
-      </w:r>
-      <w:r>
-        <w:t>”.</w:t>
-      </w:r>
-      <w:r>
-        <w:t xml:space="preserve"> </w:t>
-      </w:r>
-      <w:r>
-        <w:t>La masa de agua subterránea donde se emplaza el sondeo es la número 4000</w:t>
-      </w:r>
-      <w:r>
-        <w:t>5</w:t>
-      </w:r>
-      <w:r>
-        <w:t>9</w:t>
-      </w:r>
-      <w:r>
-        <w:t>, denominada "</w:t>
-      </w:r>
-      <w:r>
-        <w:t>La Fuente de San Esteban</w:t>
-      </w:r>
-      <w:r>
-        <w:t>”.</w:t>
-      </w:r>
-      <w:r>
-        <w:t xml:space="preserve"> </w:t>
-      </w:r>
-      <w:r>
-        <w:t>Los límites que definen el contorno de esta masa están formados por materiales impermeables de la zona de los granitoides hercínicos de las masas de Vitigudino (Noroeste), Las Batuecas (Sur) y Campo Charro (Sureste). Hacia el Suroeste se sitúa la masa de Ciudad Rodrigo y en la componente Noreste y siguiendo el sentido del flujo en esta zona, la de Salamanca, ambas pertenecientes a la cuenca terciaria del Duero.</w:t>
-      </w:r>
-    </w:p>
-    <w:p>
-      <w:pPr>
-        <w:spacing w:after="0" w:line="240" w:lineRule="auto"/>
-      </w:pPr>
-    </w:p>
-    <w:p>
-      <w:r>
-        <w:t xml:space="preserve">Se estiman unos recursos disponibles en esta masa de agua de </w:t>
-      </w:r>
-      <w:r>
-        <w:t>55,4</w:t>
-      </w:r>
-      <w:r>
-        <w:t xml:space="preserve"> </w:t>
-      </w:r>
-      <w:r>
-        <w:t>hm</w:t>
-      </w:r>
-      <w:r>
-        <w:rPr>
-          <w:vertAlign w:val="superscript"/>
-        </w:rPr>
-        <w:t>3</w:t>
-      </w:r>
-      <w:r>
-        <w:t xml:space="preserve">/año, mientras que el volumen de concesiones y autorizaciones otorgadas por la Confederación Hidrográfica del Duero en esta masa suponen un régimen de explotación de </w:t>
-      </w:r>
-      <w:r>
-        <w:t>0,259</w:t>
-      </w:r>
-      <w:r>
-        <w:t xml:space="preserve"> </w:t>
-      </w:r>
-      <w:r>
-        <w:t>hm</w:t>
-      </w:r>
-      <w:r>
-        <w:rPr>
-          <w:vertAlign w:val="superscript"/>
-        </w:rPr>
-        <w:t>3</w:t>
-      </w:r>
-      <w:r>
-        <w:t>/año</w:t>
-      </w:r>
-      <w:r>
-        <w:t xml:space="preserve"> y</w:t>
-      </w:r>
-      <w:r>
-        <w:t xml:space="preserve"> su índice de explotación en cuanto a volumen demandado</w:t>
-      </w:r>
-      <w:r>
-        <w:t xml:space="preserve"> </w:t>
-      </w:r>
-      <w:r>
-        <w:t xml:space="preserve">es de </w:t>
-      </w:r>
-      <w:r>
-        <w:t>0,</w:t>
-      </w:r>
-      <w:r>
-        <w:t>1.</w:t>
-      </w:r>
-    </w:p>
-    <w:p>
-      <w:pPr>
-        <w:spacing w:after="0" w:line="240" w:lineRule="auto"/>
-      </w:pPr>
-      <w:r>
-        <w:t>L</w:t>
-      </w:r>
-      <w:r>
-        <w:t>a evaluaci</w:t>
-      </w:r>
-      <w:r>
-        <w:t>ó</w:t>
-      </w:r>
-      <w:r>
-        <w:t xml:space="preserve">n del </w:t>
-      </w:r>
-      <w:r>
-        <w:t>E</w:t>
-      </w:r>
-      <w:r>
-        <w:t xml:space="preserve">stado </w:t>
-      </w:r>
-      <w:r>
-        <w:t>cuantitativo y cualitativo</w:t>
-      </w:r>
-      <w:r>
-        <w:t xml:space="preserve"> </w:t>
-      </w:r>
-      <w:r>
-        <w:t>a fecha más reciente</w:t>
-      </w:r>
-      <w:r>
-        <w:t xml:space="preserve"> (2013)</w:t>
-      </w:r>
-      <w:r>
-        <w:t xml:space="preserve"> se considera esta masa como en buen estado general por no encontrarse alteraciones relevantes que afecten a la totalidad de </w:t>
-      </w:r>
-      <w:proofErr w:type="gramStart"/>
-      <w:r>
-        <w:t>la misma</w:t>
-      </w:r>
-      <w:proofErr w:type="gramEnd"/>
-      <w:r>
-        <w:t>.</w:t>
-      </w:r>
-      <w:r>
-        <w:t xml:space="preserve"> A </w:t>
-      </w:r>
-      <w:r>
-        <w:t>continuación,</w:t>
-      </w:r>
-      <w:r>
-        <w:t xml:space="preserve"> se especifica más detalladamente.</w:t>
-      </w:r>
-    </w:p>
-    <w:p>
-      <w:pPr>
-        <w:spacing w:after="0" w:line="240" w:lineRule="auto"/>
-      </w:pPr>
-    </w:p>
-    <w:p>
-      <w:pPr>
-        <w:spacing w:after="0" w:line="240" w:lineRule="auto"/>
-        <w:rPr>
-          <w:u w:val="single"/>
-        </w:rPr>
-      </w:pPr>
-      <w:r>
-        <w:rPr>
-          <w:u w:val="single"/>
-        </w:rPr>
-        <w:t>Estado cuantitativo de la masa “</w:t>
-      </w:r>
-      <w:r>
-        <w:rPr>
-          <w:u w:val="single"/>
-        </w:rPr>
-        <w:t>La Fuente de San Esteban</w:t>
-      </w:r>
-      <w:r>
-        <w:rPr>
-          <w:u w:val="single"/>
-        </w:rPr>
-        <w:t>”</w:t>
-      </w:r>
-    </w:p>
-    <w:p>
-      <w:pPr>
-        <w:spacing w:after="0" w:line="240" w:lineRule="auto"/>
-        <w:rPr>
-          <w:u w:val="single"/>
-        </w:rPr>
-      </w:pPr>
-    </w:p>
-    <w:p>
-      <w:pPr>
-        <w:spacing w:after="0" w:line="240" w:lineRule="auto"/>
-        <w:ind w:left="708"/>
-      </w:pPr>
-      <w:r>
-        <w:t xml:space="preserve">Designación definitiva del estado </w:t>
-      </w:r>
-      <w:r>
-        <w:t>cuanti</w:t>
-      </w:r>
-      <w:r>
-        <w:t>ta</w:t>
-      </w:r>
-      <w:r>
-        <w:t>tivo</w:t>
-      </w:r>
-      <w:r>
-        <w:t xml:space="preserve"> de la masa subterránea</w:t>
-      </w:r>
-      <w:r>
-        <w:t xml:space="preserve">: </w:t>
-      </w:r>
-      <w:r>
-        <w:t>Bueno</w:t>
-      </w:r>
-    </w:p>
-    <w:p>
-      <w:pPr>
-        <w:spacing w:after="0" w:line="240" w:lineRule="auto"/>
-        <w:rPr>
-          <w:highlight w:val="yellow"/>
-        </w:rPr>
-      </w:pPr>
-    </w:p>
-    <w:p>
-      <w:pPr>
-        <w:spacing w:after="0" w:line="240" w:lineRule="auto"/>
-      </w:pPr>
-      <w:r>
-        <w:t>-Justificación a la asignación definitiva:</w:t>
-      </w:r>
-    </w:p>
-    <w:p>
-      <w:pPr>
-        <w:spacing w:after="0" w:line="240" w:lineRule="auto"/>
-        <w:ind w:left="708"/>
-      </w:pPr>
-    </w:p>
-    <w:p>
-      <w:pPr>
-        <w:spacing w:after="0" w:line="240" w:lineRule="auto"/>
-        <w:ind w:left="708"/>
-      </w:pPr>
-      <w:r>
-        <w:t>Índice de explotación inferior a 0,8 (0,</w:t>
-      </w:r>
-      <w:r>
-        <w:t>1</w:t>
-      </w:r>
-      <w:r>
-        <w:t>2</w:t>
-      </w:r>
-      <w:r>
-        <w:t xml:space="preserve">). </w:t>
-      </w:r>
-      <w:r>
-        <w:t xml:space="preserve">Tendencia a </w:t>
-      </w:r>
-      <w:r>
-        <w:t>largo</w:t>
-      </w:r>
-      <w:r>
-        <w:t xml:space="preserve"> plazo relativamente decreciente, pero con cambio de tendencia en los últimos 20 años. Las tendencias piezométricas del modelo no son significativas. </w:t>
-      </w:r>
-    </w:p>
-    <w:p>
-      <w:pPr>
-        <w:spacing w:after="0" w:line="240" w:lineRule="auto"/>
+      <w:r>
+        <w:t>{</w:t>
+      </w:r>
+      <w:r>
+        <w:t>{</w:t>
+      </w:r>
+      <w:proofErr w:type="spellStart"/>
+      <w:r>
+        <w:t>masas_agua_afectadas</w:t>
+      </w:r>
+      <w:proofErr w:type="spellEnd"/>
+      <w:r>
+        <w:t>}}</w:t>
+      </w:r>
+    </w:p>
+    <w:p>
+      <w:pPr>
+        <w:jc w:val="left"/>
         <w:rPr>
           <w:highlight w:val="yellow"/>
           <w:u w:val="single"/>
@@ -30380,518 +29968,17 @@
     </w:p>
     <w:p>
       <w:pPr>
-        <w:spacing w:after="0" w:line="240" w:lineRule="auto"/>
-        <w:rPr>
-          <w:u w:val="single"/>
-        </w:rPr>
-      </w:pPr>
-      <w:r>
-        <w:rPr>
-          <w:u w:val="single"/>
-        </w:rPr>
-        <w:t xml:space="preserve">Estado cualitativo de la masa </w:t>
-      </w:r>
-      <w:r>
-        <w:rPr>
-          <w:u w:val="single"/>
-        </w:rPr>
-        <w:t>“</w:t>
-      </w:r>
-      <w:r>
-        <w:rPr>
-          <w:u w:val="single"/>
-        </w:rPr>
-        <w:t>La Fuente de San Esteban</w:t>
-      </w:r>
-      <w:r>
-        <w:rPr>
-          <w:u w:val="single"/>
-        </w:rPr>
-        <w:t>”</w:t>
-      </w:r>
-    </w:p>
-    <w:p>
-      <w:pPr>
-        <w:spacing w:after="0" w:line="240" w:lineRule="auto"/>
-      </w:pPr>
-    </w:p>
-    <w:p>
-      <w:pPr>
-        <w:spacing w:after="0" w:line="240" w:lineRule="auto"/>
-        <w:ind w:left="708"/>
-      </w:pPr>
-      <w:r>
-        <w:t>Designación definitiva del estado químico de la masa subterránea</w:t>
-      </w:r>
-      <w:r>
-        <w:t xml:space="preserve">: </w:t>
-      </w:r>
-      <w:r>
-        <w:t>Buen</w:t>
-      </w:r>
-      <w:r>
-        <w:t>o</w:t>
-      </w:r>
-    </w:p>
-    <w:p>
-      <w:pPr>
-        <w:spacing w:after="0" w:line="240" w:lineRule="auto"/>
-        <w:ind w:left="708"/>
-      </w:pPr>
-    </w:p>
-    <w:p>
-      <w:pPr>
-        <w:spacing w:after="0" w:line="240" w:lineRule="auto"/>
-      </w:pPr>
-      <w:r>
-        <w:t>-</w:t>
-      </w:r>
-      <w:r>
-        <w:t>Justificación a la asignación definitiva:</w:t>
-      </w:r>
-    </w:p>
-    <w:p>
-      <w:pPr>
-        <w:spacing w:after="0" w:line="240" w:lineRule="auto"/>
-        <w:ind w:left="708"/>
-      </w:pPr>
-    </w:p>
-    <w:p>
-      <w:pPr>
-        <w:spacing w:after="0" w:line="240" w:lineRule="auto"/>
-        <w:ind w:left="708"/>
-      </w:pPr>
-      <w:r>
-        <w:t>No se detectan valores que excedan las normas de calidad y/o los valores umbral propuestos para esta masa.</w:t>
-      </w:r>
-      <w:r>
-        <w:t xml:space="preserve"> </w:t>
-      </w:r>
-      <w:r>
-        <w:t xml:space="preserve">No se encuentran evidencias de salinización. No se considera afección sobre las MSPF asociadas a aguas subterráneas. Test 4 - Buen estado No se considera afección ETDAS (Ecosistemas terrestres dependientes de las aguas subterráneas). </w:t>
-      </w:r>
-      <w:r>
-        <w:t xml:space="preserve">No </w:t>
-      </w:r>
-      <w:r>
-        <w:t xml:space="preserve">se hallan evidencias de afección a Zonas protegidas por captación de aguas de consumo. </w:t>
-      </w:r>
-    </w:p>
-    <w:p>
-      <w:pPr>
-        <w:spacing w:after="0" w:line="240" w:lineRule="auto"/>
-      </w:pPr>
-    </w:p>
-    <w:p>
-      <w:pPr>
-        <w:spacing w:after="0" w:line="240" w:lineRule="auto"/>
-        <w:rPr>
-          <w:u w:val="single"/>
-        </w:rPr>
-      </w:pPr>
-      <w:r>
-        <w:rPr>
-          <w:u w:val="single"/>
-        </w:rPr>
-        <w:t>Hidrogeología</w:t>
-      </w:r>
-    </w:p>
-    <w:p>
-      <w:pPr>
-        <w:spacing w:after="0" w:line="240" w:lineRule="auto"/>
-      </w:pPr>
-    </w:p>
-    <w:p>
-      <w:pPr>
-        <w:spacing w:before="120" w:after="0" w:line="240" w:lineRule="auto"/>
-      </w:pPr>
-      <w:r>
-        <w:lastRenderedPageBreak/>
-        <w:t>En el ámbito territorial del proyecto, los materiales aflorantes pueden clasificarse en las siguientes unidades litológicas, con diferente comportamiento hidrogeológico:</w:t>
-      </w:r>
-    </w:p>
-    <w:p>
-      <w:pPr>
-        <w:numPr>
-          <w:ilvl w:val="0"/>
-          <w:numId w:val="21"/>
-        </w:numPr>
-        <w:spacing w:before="120" w:after="0" w:line="240" w:lineRule="auto"/>
-      </w:pPr>
-      <w:r>
-        <w:t>Depósitos Cuaternarios: Tienen especial relevancia los aluviales asociados al río Yeltes, de gran extensión. Estos depósitos están formados fundamentalmente por gravas con elevada porosidad, lo que les confiere alta permeabilidad. Permiten la captación de agua subterránea a poca profundidad mediante pozos de excavación manual, siendo habituales en zonas ribereñas.</w:t>
-      </w:r>
-    </w:p>
-    <w:p>
-      <w:pPr>
-        <w:numPr>
-          <w:ilvl w:val="0"/>
-          <w:numId w:val="21"/>
-        </w:numPr>
-        <w:spacing w:before="120" w:after="0" w:line="240" w:lineRule="auto"/>
-      </w:pPr>
-      <w:proofErr w:type="spellStart"/>
-      <w:r>
-        <w:t>Metasedimentos</w:t>
-      </w:r>
-      <w:proofErr w:type="spellEnd"/>
-      <w:r>
-        <w:t xml:space="preserve"> ordovícicos (areniscas y pizarras): Se trata de formaciones arenosas intensamente fracturadas, lo que otorga a estos materiales permeabilidades medias a altas. En zonas de contacto con unidades pizarrosas, pueden aparecer surgencias y manantiales que proporcionan caudales moderados, especialmente en áreas de relieve favorable.</w:t>
-      </w:r>
-    </w:p>
-    <w:p>
-      <w:pPr>
-        <w:numPr>
-          <w:ilvl w:val="0"/>
-          <w:numId w:val="21"/>
-        </w:numPr>
-        <w:spacing w:before="120" w:after="0" w:line="240" w:lineRule="auto"/>
-      </w:pPr>
-      <w:r>
-        <w:t>Granitos:</w:t>
-      </w:r>
-      <w:r>
-        <w:t xml:space="preserve"> </w:t>
-      </w:r>
-      <w:r>
-        <w:t>Los materiales graníticos presentan muy baja permeabilidad de forma generalizada, salvo en zonas de intensa fracturación, donde pueden localizarse manantiales de bajo caudal (habitualmente inferiores a 0,1 l/s). Un caso singular es el manantial del balneario de Retortillo, que constituye una excepción local con mayor descarga natural.</w:t>
-      </w:r>
-    </w:p>
-    <w:p>
-      <w:pPr>
-        <w:numPr>
-          <w:ilvl w:val="0"/>
-          <w:numId w:val="21"/>
-        </w:numPr>
-        <w:spacing w:before="120" w:after="0" w:line="240" w:lineRule="auto"/>
-      </w:pPr>
-      <w:r>
-        <w:t>Sedimentos Terciarios detríticos:</w:t>
-      </w:r>
-      <w:r>
-        <w:t xml:space="preserve"> </w:t>
-      </w:r>
-      <w:r>
-        <w:t xml:space="preserve">Estos materiales rellenan una fosa tectónica con dirección preferente sudoeste-noreste (SW-NE). Están compuestos por conglomerados y </w:t>
-      </w:r>
-      <w:proofErr w:type="spellStart"/>
-      <w:r>
-        <w:t>arcósas</w:t>
-      </w:r>
-      <w:proofErr w:type="spellEnd"/>
-      <w:r>
-        <w:t xml:space="preserve"> con grados de cementación variables. Se distinguen dos niveles principales:</w:t>
-      </w:r>
-    </w:p>
-    <w:p>
-      <w:pPr>
-        <w:numPr>
-          <w:ilvl w:val="1"/>
-          <w:numId w:val="21"/>
-        </w:numPr>
-        <w:spacing w:before="120" w:after="0" w:line="240" w:lineRule="auto"/>
-      </w:pPr>
-      <w:r>
-        <w:t xml:space="preserve">Un tramo basal constituido por gravas y arenas </w:t>
-      </w:r>
-      <w:proofErr w:type="spellStart"/>
-      <w:r>
-        <w:t>arcósicas</w:t>
-      </w:r>
-      <w:proofErr w:type="spellEnd"/>
-      <w:r>
-        <w:t>, con permeabilidad moderada a alta, dependiendo del grado de consolidación.</w:t>
-      </w:r>
-    </w:p>
-    <w:p>
-      <w:pPr>
-        <w:numPr>
-          <w:ilvl w:val="1"/>
-          <w:numId w:val="21"/>
-        </w:numPr>
-        <w:spacing w:before="120" w:after="0" w:line="240" w:lineRule="auto"/>
-      </w:pPr>
-      <w:r>
-        <w:t>Un tramo superior más conglomerático, con alta proporción de matriz arcillosa, lo que reduce significativamente su permeabilidad. Este último actúa, en general, como una unidad de baja transmisividad hidráulica.</w:t>
-      </w:r>
-    </w:p>
-    <w:p>
-      <w:pPr>
-        <w:spacing w:after="0" w:line="240" w:lineRule="auto"/>
-      </w:pPr>
-    </w:p>
-    <w:p>
-      <w:pPr>
-        <w:spacing w:after="0" w:line="240" w:lineRule="auto"/>
-      </w:pPr>
-    </w:p>
-    <w:p>
-      <w:pPr>
-        <w:spacing w:after="0" w:line="240" w:lineRule="auto"/>
-        <w:rPr>
-          <w:u w:val="single"/>
-        </w:rPr>
-      </w:pPr>
-      <w:r>
-        <w:rPr>
-          <w:u w:val="single"/>
-        </w:rPr>
-        <w:t>Repercusiones a largo plazo sobre el estado de las masas de agua afectadas</w:t>
-      </w:r>
-    </w:p>
-    <w:p>
-      <w:pPr>
-        <w:spacing w:after="0" w:line="240" w:lineRule="auto"/>
-        <w:rPr>
-          <w:u w:val="single"/>
-        </w:rPr>
-      </w:pPr>
-    </w:p>
-    <w:p>
-      <w:pPr>
-        <w:spacing w:after="0" w:line="240" w:lineRule="auto"/>
-      </w:pPr>
-      <w:r>
-        <w:t xml:space="preserve">Teniendo en cuenta las anteriores consideraciones, </w:t>
-      </w:r>
-      <w:r>
-        <w:t>extraídas</w:t>
-      </w:r>
-      <w:r>
-        <w:t xml:space="preserve"> de la aplicación MIRAME de Confederación Hidrográfica del Duero y del IGME en la</w:t>
-      </w:r>
-      <w:r>
-        <w:t xml:space="preserve"> Hoja n°</w:t>
-      </w:r>
-      <w:r>
-        <w:t>502</w:t>
-      </w:r>
-      <w:r>
-        <w:t xml:space="preserve"> del Mapa Topográfico Nacional de España, “</w:t>
-      </w:r>
-      <w:r>
-        <w:t>Matilla de los Caños</w:t>
-      </w:r>
-      <w:r>
-        <w:t>”</w:t>
-      </w:r>
-      <w:r>
-        <w:t xml:space="preserve">, se encuentra la masa de agua subterránea </w:t>
-      </w:r>
-      <w:r>
-        <w:t>“</w:t>
-      </w:r>
-      <w:r>
-        <w:t>La Fuente de San Esteban</w:t>
-      </w:r>
-      <w:r>
-        <w:t>”</w:t>
-      </w:r>
-      <w:r>
-        <w:t>.</w:t>
-      </w:r>
-    </w:p>
-    <w:p>
-      <w:pPr>
-        <w:spacing w:after="0" w:line="240" w:lineRule="auto"/>
-      </w:pPr>
-    </w:p>
-    <w:p>
-      <w:pPr>
-        <w:spacing w:after="0" w:line="240" w:lineRule="auto"/>
-      </w:pPr>
-      <w:r>
-        <w:t xml:space="preserve">Se considera una masa con índice de explotación </w:t>
-      </w:r>
-      <w:r>
-        <w:t xml:space="preserve">(volumen demandado) </w:t>
-      </w:r>
-      <w:r>
-        <w:t>bajo</w:t>
-      </w:r>
-      <w:r>
-        <w:t xml:space="preserve">, situándose el mismo en </w:t>
-      </w:r>
-      <w:r>
-        <w:t>0</w:t>
-      </w:r>
-      <w:r>
-        <w:t>,1</w:t>
-      </w:r>
-      <w:r>
-        <w:t xml:space="preserve">. Por lo que el recurso disponible se considera </w:t>
-      </w:r>
-      <w:r>
-        <w:t>mayor que</w:t>
-      </w:r>
-      <w:r>
-        <w:t xml:space="preserve"> el derecho de explotación.</w:t>
-      </w:r>
-    </w:p>
-    <w:p>
-      <w:pPr>
-        <w:spacing w:after="0" w:line="240" w:lineRule="auto"/>
-      </w:pPr>
-    </w:p>
-    <w:p>
-      <w:pPr>
-        <w:spacing w:after="0" w:line="240" w:lineRule="auto"/>
-      </w:pPr>
-      <w:r>
-        <w:t xml:space="preserve">A largo plazo se puede considerar una disminución del nivel piezométrico debido a la sobre explotación de </w:t>
-      </w:r>
-      <w:r>
-        <w:t>dichas masas subterráneas</w:t>
-      </w:r>
-      <w:r>
-        <w:t>, pero muy a largo plazo por los escasos sondeos disponibles en la zona</w:t>
-      </w:r>
-      <w:r>
-        <w:t>.</w:t>
-      </w:r>
-    </w:p>
-    <w:p>
-      <w:pPr>
-        <w:spacing w:after="0" w:line="240" w:lineRule="auto"/>
-        <w:rPr>
-          <w:highlight w:val="yellow"/>
-        </w:rPr>
-      </w:pPr>
-    </w:p>
-    <w:p>
-      <w:pPr>
-        <w:spacing w:after="0" w:line="240" w:lineRule="auto"/>
-      </w:pPr>
-      <w:r>
-        <w:t>El organismo encargado de gestionar el recurso disponible y las concesiones de extracción de aguas subterráneas es la Confederación Hidrográfica del Duero, para lo cual se exige la implantación de un dispositivo de control del volumen de agua extraído.</w:t>
-      </w:r>
-      <w:r>
-        <w:t xml:space="preserve"> En el caso de que la zona de </w:t>
-      </w:r>
-      <w:r>
-        <w:t>La Fuente de San Esteban</w:t>
-      </w:r>
-      <w:r>
-        <w:t xml:space="preserve"> </w:t>
-      </w:r>
-      <w:r>
-        <w:t xml:space="preserve">comenzase a estar sobreexplotada, se </w:t>
-      </w:r>
-      <w:r>
-        <w:lastRenderedPageBreak/>
-        <w:t xml:space="preserve">consideraría por parte de la Confederación Hidrográfica del Duero, cerrar el acuífero y no permitir más extracciones de agua. </w:t>
-      </w:r>
-    </w:p>
-    <w:p>
-      <w:pPr>
-        <w:spacing w:after="0" w:line="240" w:lineRule="auto"/>
-        <w:rPr>
-          <w:highlight w:val="yellow"/>
-        </w:rPr>
-      </w:pPr>
-    </w:p>
-    <w:p>
-      <w:pPr>
-        <w:spacing w:after="0" w:line="240" w:lineRule="auto"/>
-      </w:pPr>
-      <w:r>
-        <w:t xml:space="preserve">La zona de </w:t>
-      </w:r>
-      <w:r>
-        <w:t>Carrascal del Obispo</w:t>
-      </w:r>
-      <w:r>
-        <w:t xml:space="preserve"> </w:t>
-      </w:r>
-      <w:r>
-        <w:t xml:space="preserve">está considerada como zona </w:t>
-      </w:r>
-      <w:r>
-        <w:t xml:space="preserve">libre de </w:t>
-      </w:r>
-      <w:r>
-        <w:t>limitaciones en la cual se pueden considerar las obras de captación de aguas subterráneas</w:t>
-      </w:r>
-      <w:r>
-        <w:t>.</w:t>
-      </w:r>
-      <w:r>
-        <w:t xml:space="preserve"> Además, en las medidas normativas </w:t>
-      </w:r>
-      <w:r>
-        <w:t xml:space="preserve">de </w:t>
-      </w:r>
-      <w:r>
-        <w:t>Protección del estado cuantitativo de las masas de agua subterránea</w:t>
-      </w:r>
-      <w:r>
-        <w:t xml:space="preserve"> y </w:t>
-      </w:r>
-      <w:r>
-        <w:t>Protección frente a la contaminación difusa de las masas de agua</w:t>
-      </w:r>
-      <w:r>
-        <w:t xml:space="preserve">, de periodo de ejecución 2022-2027 </w:t>
-      </w:r>
-      <w:r>
-        <w:t>se ha considerado s</w:t>
-      </w:r>
-      <w:r>
-        <w:t>in necesidades de inversión</w:t>
-      </w:r>
-      <w:r>
-        <w:t>.</w:t>
-      </w:r>
-    </w:p>
-    <w:p>
-      <w:pPr>
+        <w:jc w:val="left"/>
         <w:rPr>
           <w:highlight w:val="yellow"/>
           <w:u w:val="single"/>
         </w:rPr>
       </w:pPr>
-    </w:p>
-    <w:p>
-      <w:pPr>
+      <w:r>
         <w:rPr>
           <w:highlight w:val="yellow"/>
           <w:u w:val="single"/>
         </w:rPr>
-      </w:pPr>
-    </w:p>
-    <w:p>
-      <w:pPr>
-        <w:pStyle w:val="Prrafodelista"/>
-        <w:ind w:left="1440"/>
-        <w:rPr>
-          <w:highlight w:val="yellow"/>
-          <w:u w:val="single"/>
-        </w:rPr>
-      </w:pPr>
-    </w:p>
-    <w:p>
-      <w:pPr>
-        <w:pStyle w:val="Prrafodelista"/>
-        <w:ind w:left="1440"/>
-        <w:rPr>
-          <w:highlight w:val="yellow"/>
-          <w:u w:val="single"/>
-        </w:rPr>
-      </w:pPr>
-    </w:p>
-    <w:p>
-      <w:pPr>
-        <w:jc w:val="left"/>
-        <w:rPr>
-          <w:highlight w:val="yellow"/>
-          <w:u w:val="single"/>
-        </w:rPr>
-      </w:pPr>
-      <w:r>
-        <w:rPr>
-          <w:highlight w:val="yellow"/>
-          <w:u w:val="single"/>
-        </w:rPr>
         <w:br w:type="page"/>
       </w:r>
     </w:p>
@@ -30915,27 +30002,14 @@
       </w:r>
     </w:p>
     <w:p>
-      <w:proofErr w:type="gramStart"/>
-      <w:r>
-        <w:t>Las sustancias a emplear</w:t>
-      </w:r>
-      <w:proofErr w:type="gramEnd"/>
-      <w:r>
-        <w:t xml:space="preserve"> en la obra son propias de cualquier vehículo motriz autopropulsado,</w:t>
+      <w:r>
+        <w:t>Las sustancias a emplear en la obra son propias de cualquier vehículo motriz autopropulsado,</w:t>
       </w:r>
       <w:r>
         <w:t xml:space="preserve"> no considerándose estas como sustancias peligrosas,</w:t>
       </w:r>
       <w:r>
-        <w:t xml:space="preserve"> por lo </w:t>
-      </w:r>
-      <w:proofErr w:type="gramStart"/>
-      <w:r>
-        <w:t>que</w:t>
-      </w:r>
-      <w:proofErr w:type="gramEnd"/>
-      <w:r>
-        <w:t xml:space="preserve"> en caso de vertido o derrame, se procederá a la descontaminación de la zona, mediante empresa gestora autorizada. Dicho accidente anteriormente descrito es el único contemplado en un proyecto de estas características.</w:t>
+        <w:t xml:space="preserve"> por lo que en caso de vertido o derrame, se procederá a la descontaminación de la zona, mediante empresa gestora autorizada. Dicho accidente anteriormente descrito es el único contemplado en un proyecto de estas características.</w:t>
       </w:r>
     </w:p>
     <w:p>
@@ -31302,13 +30376,8 @@
       </w:r>
     </w:p>
     <w:p>
-      <w:proofErr w:type="gramStart"/>
-      <w:r>
-        <w:t>Toda la maquinaria a utilizar</w:t>
-      </w:r>
-      <w:proofErr w:type="gramEnd"/>
-      <w:r>
-        <w:t xml:space="preserve"> cumplirá la normativa vigente en lo que concierne a la protección de medio ambiente, producción de humos y ruidos. El repostaje de la maquinaria se ejecutará fuera de la zona, con los medios y en lugar adecuado.</w:t>
+      <w:r>
+        <w:t>Toda la maquinaria a utilizar cumplirá la normativa vigente en lo que concierne a la protección de medio ambiente, producción de humos y ruidos. El repostaje de la maquinaria se ejecutará fuera de la zona, con los medios y en lugar adecuado.</w:t>
       </w:r>
       <w:r>
         <w:rPr>
@@ -31799,23 +30868,7 @@
     </w:p>
     <w:p>
       <w:r>
-        <w:t xml:space="preserve">El principal objetivo del </w:t>
-      </w:r>
-      <w:proofErr w:type="gramStart"/>
-      <w:r>
-        <w:t>PVA,</w:t>
-      </w:r>
-      <w:proofErr w:type="gramEnd"/>
-      <w:r>
-        <w:t xml:space="preserve"> es el de velar </w:t>
-      </w:r>
-      <w:proofErr w:type="gramStart"/>
-      <w:r>
-        <w:t>para</w:t>
-      </w:r>
-      <w:proofErr w:type="gramEnd"/>
-      <w:r>
-        <w:t xml:space="preserve"> que el proyecto o la actividad que se someta a control se lleve a término según los condicionantes ambientales impuestos por la administración. </w:t>
+        <w:t xml:space="preserve">El principal objetivo del PVA, es el de velar para que el proyecto o la actividad que se someta a control se lleve a término según los condicionantes ambientales impuestos por la administración. </w:t>
       </w:r>
     </w:p>
     <w:p>
@@ -33630,12 +32683,14 @@
       <w:jc w:val="center"/>
       <w:rPr>
         <w:rFonts w:ascii="Arial" w:hAnsi="Arial" w:cs="Arial"/>
+        <w:caps/>
         <w:sz w:val="14"/>
         <w:lang w:val="es-ES"/>
       </w:rPr>
     </w:pPr>
     <w:r>
       <w:rPr>
+        <w:caps/>
         <w:noProof/>
         <w:lang w:val="es-ES"/>
       </w:rPr>
@@ -33708,6 +32763,7 @@
     <w:r>
       <w:rPr>
         <w:rFonts w:ascii="Arial" w:hAnsi="Arial" w:cs="Arial"/>
+        <w:caps/>
         <w:sz w:val="14"/>
         <w:lang w:val="es-ES"/>
       </w:rPr>
@@ -33716,6 +32772,7 @@
     <w:r>
       <w:rPr>
         <w:rFonts w:ascii="Arial" w:hAnsi="Arial" w:cs="Arial"/>
+        <w:caps/>
         <w:sz w:val="14"/>
         <w:lang w:val="es-ES"/>
       </w:rPr>
@@ -33724,6 +32781,7 @@
     <w:r>
       <w:rPr>
         <w:rFonts w:ascii="Arial" w:hAnsi="Arial" w:cs="Arial"/>
+        <w:caps/>
         <w:sz w:val="14"/>
         <w:lang w:val="es-ES"/>
       </w:rPr>
@@ -33732,6 +32790,7 @@
     <w:r>
       <w:rPr>
         <w:rFonts w:ascii="Arial" w:hAnsi="Arial" w:cs="Arial"/>
+        <w:caps/>
         <w:sz w:val="14"/>
         <w:lang w:val="es-ES"/>
       </w:rPr>
@@ -33740,14 +32799,25 @@
     <w:r>
       <w:rPr>
         <w:rFonts w:ascii="Arial" w:hAnsi="Arial" w:cs="Arial"/>
+        <w:caps/>
         <w:sz w:val="14"/>
         <w:lang w:val="es-ES"/>
       </w:rPr>
-      <w:t>EN</w:t>
+      <w:t xml:space="preserve">EN </w:t>
     </w:r>
     <w:r>
       <w:rPr>
         <w:rFonts w:ascii="Arial" w:hAnsi="Arial" w:cs="Arial"/>
+        <w:caps/>
+        <w:sz w:val="14"/>
+        <w:lang w:val="es-ES"/>
+      </w:rPr>
+      <w:t>{{MUNICIPIO}}</w:t>
+    </w:r>
+    <w:r>
+      <w:rPr>
+        <w:rFonts w:ascii="Arial" w:hAnsi="Arial" w:cs="Arial"/>
+        <w:caps/>
         <w:sz w:val="14"/>
         <w:lang w:val="es-ES"/>
       </w:rPr>
@@ -33756,22 +32826,7 @@
     <w:r>
       <w:rPr>
         <w:rFonts w:ascii="Arial" w:hAnsi="Arial" w:cs="Arial"/>
-        <w:sz w:val="14"/>
-        <w:lang w:val="es-ES"/>
-      </w:rPr>
-      <w:t>{{MUNICIPIO}}</w:t>
-    </w:r>
-    <w:r>
-      <w:rPr>
-        <w:rFonts w:ascii="Arial" w:hAnsi="Arial" w:cs="Arial"/>
-        <w:sz w:val="14"/>
-        <w:lang w:val="es-ES"/>
-      </w:rPr>
-      <w:t xml:space="preserve"> </w:t>
-    </w:r>
-    <w:r>
-      <w:rPr>
-        <w:rFonts w:ascii="Arial" w:hAnsi="Arial" w:cs="Arial"/>
+        <w:caps/>
         <w:sz w:val="14"/>
         <w:lang w:val="es-ES"/>
       </w:rPr>
@@ -33780,6 +32835,7 @@
     <w:r>
       <w:rPr>
         <w:rFonts w:ascii="Arial" w:hAnsi="Arial" w:cs="Arial"/>
+        <w:caps/>
         <w:sz w:val="14"/>
         <w:lang w:val="es-ES"/>
       </w:rPr>

</xml_diff>